<commit_message>
completed video 10 (mongodb scheme)
</commit_message>
<xml_diff>
--- a/src/notes.docx
+++ b/src/notes.docx
@@ -36,7 +36,15 @@
         <w:t>وطلما انت هتستعمل</w:t>
       </w:r>
       <w:r>
-        <w:t xml:space="preserve"> fastapi </w:t>
+        <w:t xml:space="preserve"> </w:t>
+      </w:r>
+      <w:proofErr w:type="spellStart"/>
+      <w:r>
+        <w:t>fastapi</w:t>
+      </w:r>
+      <w:proofErr w:type="spellEnd"/>
+      <w:r>
+        <w:t xml:space="preserve"> </w:t>
       </w:r>
       <w:r>
         <w:rPr>
@@ -97,7 +105,15 @@
         <w:t>يبقي تحط فيه ملف ال</w:t>
       </w:r>
       <w:r>
-        <w:t xml:space="preserve"> __init__ </w:t>
+        <w:t xml:space="preserve"> __</w:t>
+      </w:r>
+      <w:proofErr w:type="spellStart"/>
+      <w:r>
+        <w:t>init</w:t>
+      </w:r>
+      <w:proofErr w:type="spellEnd"/>
+      <w:r>
+        <w:t xml:space="preserve">__ </w:t>
       </w:r>
       <w:r>
         <w:rPr>
@@ -286,12 +302,14 @@
         </w:rPr>
         <w:t xml:space="preserve"> عندنا والي هي وظيفتها بس انها تعرفك انه ال </w:t>
       </w:r>
+      <w:proofErr w:type="spellStart"/>
       <w:r>
         <w:rPr>
           <w:lang w:bidi="ar-EG"/>
         </w:rPr>
         <w:t>api</w:t>
       </w:r>
+      <w:proofErr w:type="spellEnd"/>
       <w:r>
         <w:rPr>
           <w:rFonts w:hint="cs"/>
@@ -545,7 +563,21 @@
         <w:rPr>
           <w:lang w:bidi="ar-EG"/>
         </w:rPr>
-        <w:t>.include_router()</w:t>
+        <w:t>.</w:t>
+      </w:r>
+      <w:proofErr w:type="spellStart"/>
+      <w:r>
+        <w:rPr>
+          <w:lang w:bidi="ar-EG"/>
+        </w:rPr>
+        <w:t>include_router</w:t>
+      </w:r>
+      <w:proofErr w:type="spellEnd"/>
+      <w:r>
+        <w:rPr>
+          <w:lang w:bidi="ar-EG"/>
+        </w:rPr>
+        <w:t>()</w:t>
       </w:r>
     </w:p>
     <w:p>
@@ -591,12 +623,14 @@
         </w:rPr>
         <w:t xml:space="preserve"> واسمه </w:t>
       </w:r>
+      <w:proofErr w:type="spellStart"/>
       <w:r>
         <w:rPr>
           <w:lang w:bidi="ar-EG"/>
         </w:rPr>
         <w:t>base_router</w:t>
       </w:r>
+      <w:proofErr w:type="spellEnd"/>
     </w:p>
     <w:p>
       <w:pPr>
@@ -700,6 +734,7 @@
         </w:rPr>
         <w:t xml:space="preserve"> احنا بنعملها باستخدام ال </w:t>
       </w:r>
+      <w:proofErr w:type="spellStart"/>
       <w:r>
         <w:rPr>
           <w:color w:val="FF0000"/>
@@ -707,6 +742,7 @@
         </w:rPr>
         <w:t>APIRouter</w:t>
       </w:r>
+      <w:proofErr w:type="spellEnd"/>
       <w:r>
         <w:rPr>
           <w:rFonts w:hint="cs"/>
@@ -855,12 +891,37 @@
         </w:rPr>
         <w:t xml:space="preserve">وده هيكون من خلال </w:t>
       </w:r>
+      <w:proofErr w:type="spellStart"/>
       <w:r>
         <w:rPr>
           <w:color w:val="FF0000"/>
           <w:lang w:bidi="ar-EG"/>
         </w:rPr>
-        <w:t>app.include_router(filename.apirouterName)</w:t>
+        <w:t>app.include_router</w:t>
+      </w:r>
+      <w:proofErr w:type="spellEnd"/>
+      <w:r>
+        <w:rPr>
+          <w:color w:val="FF0000"/>
+          <w:lang w:bidi="ar-EG"/>
+        </w:rPr>
+        <w:t>(</w:t>
+      </w:r>
+      <w:proofErr w:type="spellStart"/>
+      <w:r>
+        <w:rPr>
+          <w:color w:val="FF0000"/>
+          <w:lang w:bidi="ar-EG"/>
+        </w:rPr>
+        <w:t>filename.apirouterName</w:t>
+      </w:r>
+      <w:proofErr w:type="spellEnd"/>
+      <w:r>
+        <w:rPr>
+          <w:color w:val="FF0000"/>
+          <w:lang w:bidi="ar-EG"/>
+        </w:rPr>
+        <w:t>)</w:t>
       </w:r>
     </w:p>
     <w:p>
@@ -969,12 +1030,14 @@
         <w:lastRenderedPageBreak/>
         <w:t xml:space="preserve">عندك بقي كل </w:t>
       </w:r>
+      <w:proofErr w:type="spellStart"/>
       <w:r>
         <w:rPr>
           <w:lang w:bidi="ar-EG"/>
         </w:rPr>
         <w:t>APIRouter</w:t>
       </w:r>
+      <w:proofErr w:type="spellEnd"/>
     </w:p>
     <w:p>
       <w:pPr>
@@ -1006,12 +1069,14 @@
         </w:rPr>
         <w:t xml:space="preserve"> (يعني حاجه بتكون ثابته في ال </w:t>
       </w:r>
+      <w:proofErr w:type="spellStart"/>
       <w:r>
         <w:rPr>
           <w:lang w:bidi="ar-EG"/>
         </w:rPr>
         <w:t>url</w:t>
       </w:r>
+      <w:proofErr w:type="spellEnd"/>
       <w:r>
         <w:rPr>
           <w:rFonts w:hint="cs"/>
@@ -1234,12 +1299,14 @@
           <w:lang w:bidi="ar-EG"/>
         </w:rPr>
       </w:pPr>
+      <w:proofErr w:type="spellStart"/>
       <w:r>
         <w:rPr>
           <w:lang w:bidi="ar-EG"/>
         </w:rPr>
         <w:t>SyntaxError</w:t>
       </w:r>
+      <w:proofErr w:type="spellEnd"/>
     </w:p>
     <w:p>
       <w:pPr>
@@ -1275,12 +1342,14 @@
           <w:lang w:bidi="ar-EG"/>
         </w:rPr>
       </w:pPr>
+      <w:proofErr w:type="spellStart"/>
       <w:r>
         <w:rPr>
           <w:lang w:bidi="ar-EG"/>
         </w:rPr>
         <w:t>NameError</w:t>
       </w:r>
+      <w:proofErr w:type="spellEnd"/>
     </w:p>
     <w:p>
       <w:pPr>
@@ -1343,12 +1412,14 @@
           <w:lang w:bidi="ar-EG"/>
         </w:rPr>
       </w:pPr>
+      <w:proofErr w:type="spellStart"/>
       <w:r>
         <w:rPr>
           <w:lang w:bidi="ar-EG"/>
         </w:rPr>
         <w:t>typeError</w:t>
       </w:r>
+      <w:proofErr w:type="spellEnd"/>
     </w:p>
     <w:p>
       <w:pPr>
@@ -1396,28 +1467,31 @@
         </w:rPr>
         <w:t xml:space="preserve"> مع </w:t>
       </w:r>
+      <w:proofErr w:type="spellStart"/>
       <w:r>
         <w:rPr>
           <w:lang w:bidi="ar-EG"/>
         </w:rPr>
         <w:t>integar</w:t>
       </w:r>
-    </w:p>
-    <w:p>
-      <w:pPr>
-        <w:bidi/>
-        <w:rPr>
-          <w:lang w:bidi="ar-EG"/>
-        </w:rPr>
-      </w:pPr>
-    </w:p>
-    <w:p>
-      <w:pPr>
-        <w:bidi/>
-        <w:rPr>
-          <w:lang w:bidi="ar-EG"/>
-        </w:rPr>
-      </w:pPr>
+      <w:proofErr w:type="spellEnd"/>
+    </w:p>
+    <w:p>
+      <w:pPr>
+        <w:bidi/>
+        <w:rPr>
+          <w:lang w:bidi="ar-EG"/>
+        </w:rPr>
+      </w:pPr>
+    </w:p>
+    <w:p>
+      <w:pPr>
+        <w:bidi/>
+        <w:rPr>
+          <w:lang w:bidi="ar-EG"/>
+        </w:rPr>
+      </w:pPr>
+      <w:proofErr w:type="spellStart"/>
       <w:r>
         <w:rPr>
           <w:lang w:bidi="ar-EG"/>
@@ -1425,6 +1499,7 @@
         <w:lastRenderedPageBreak/>
         <w:t>AttributeError</w:t>
       </w:r>
+      <w:proofErr w:type="spellEnd"/>
     </w:p>
     <w:p>
       <w:pPr>
@@ -1487,9 +1562,19 @@
           <w:rtl/>
         </w:rPr>
       </w:pPr>
-      <w:r>
-        <w:t>ImportError / ModuleNotFoundError</w:t>
-      </w:r>
+      <w:proofErr w:type="spellStart"/>
+      <w:r>
+        <w:t>ImportError</w:t>
+      </w:r>
+      <w:proofErr w:type="spellEnd"/>
+      <w:r>
+        <w:t xml:space="preserve"> / </w:t>
+      </w:r>
+      <w:proofErr w:type="spellStart"/>
+      <w:r>
+        <w:t>ModuleNotFoundError</w:t>
+      </w:r>
+      <w:proofErr w:type="spellEnd"/>
     </w:p>
     <w:p>
       <w:pPr>
@@ -2021,12 +2106,14 @@
         </w:rPr>
         <w:t xml:space="preserve">وبيكون واخدها من مكتبه ال </w:t>
       </w:r>
+      <w:proofErr w:type="spellStart"/>
       <w:r>
         <w:rPr>
           <w:lang w:bidi="ar-EG"/>
         </w:rPr>
         <w:t>pydantic</w:t>
       </w:r>
+      <w:proofErr w:type="spellEnd"/>
       <w:r>
         <w:rPr>
           <w:rFonts w:hint="cs"/>
@@ -2446,12 +2533,14 @@
         <w:lastRenderedPageBreak/>
         <w:t xml:space="preserve">او الطريقه التانيه (ودي الاحسن في </w:t>
       </w:r>
+      <w:proofErr w:type="spellStart"/>
       <w:r>
         <w:rPr>
           <w:lang w:bidi="ar-EG"/>
         </w:rPr>
         <w:t>fastapi</w:t>
       </w:r>
+      <w:proofErr w:type="spellEnd"/>
       <w:r>
         <w:rPr>
           <w:rFonts w:hint="cs"/>
@@ -2480,12 +2569,14 @@
         </w:rPr>
         <w:t xml:space="preserve">ودي عبارة عن حاجه من </w:t>
       </w:r>
+      <w:proofErr w:type="spellStart"/>
       <w:r>
         <w:rPr>
           <w:lang w:bidi="ar-EG"/>
         </w:rPr>
         <w:t>fastapi</w:t>
       </w:r>
+      <w:proofErr w:type="spellEnd"/>
       <w:r>
         <w:rPr>
           <w:rFonts w:hint="cs"/>
@@ -2653,12 +2744,14 @@
         <w:lastRenderedPageBreak/>
         <w:t xml:space="preserve">فدي بتكون مفيده جدا ل </w:t>
       </w:r>
+      <w:proofErr w:type="spellStart"/>
       <w:r>
         <w:rPr>
           <w:lang w:bidi="ar-EG"/>
         </w:rPr>
         <w:t>fastapi</w:t>
       </w:r>
+      <w:proofErr w:type="spellEnd"/>
       <w:r>
         <w:rPr>
           <w:rFonts w:hint="cs"/>
@@ -3312,12 +3405,14 @@
         </w:rPr>
         <w:t xml:space="preserve"> هيكون لي حاجه اسمها </w:t>
       </w:r>
+      <w:proofErr w:type="spellStart"/>
       <w:r>
         <w:rPr>
           <w:lang w:bidi="ar-EG"/>
         </w:rPr>
         <w:t>project_id</w:t>
       </w:r>
+      <w:proofErr w:type="spellEnd"/>
       <w:r>
         <w:rPr>
           <w:rFonts w:hint="cs"/>
@@ -3640,12 +3735,14 @@
         </w:rPr>
         <w:t xml:space="preserve"> في </w:t>
       </w:r>
+      <w:proofErr w:type="spellStart"/>
       <w:r>
         <w:rPr>
           <w:lang w:bidi="ar-EG"/>
         </w:rPr>
         <w:t>fastapi</w:t>
       </w:r>
+      <w:proofErr w:type="spellEnd"/>
       <w:r>
         <w:rPr>
           <w:rFonts w:hint="cs"/>
@@ -3654,12 +3751,14 @@
         </w:rPr>
         <w:t xml:space="preserve"> بتجيب منها حاجه اسمها </w:t>
       </w:r>
+      <w:proofErr w:type="spellStart"/>
       <w:r>
         <w:rPr>
           <w:lang w:bidi="ar-EG"/>
         </w:rPr>
         <w:t>UploadFile</w:t>
       </w:r>
+      <w:proofErr w:type="spellEnd"/>
     </w:p>
     <w:p>
       <w:pPr>
@@ -4015,12 +4114,14 @@
         </w:rPr>
         <w:t xml:space="preserve">فانا اول حاجه هروح اعمل ملف اسمه </w:t>
       </w:r>
+      <w:proofErr w:type="spellStart"/>
       <w:r>
         <w:rPr>
           <w:lang w:bidi="ar-EG"/>
         </w:rPr>
         <w:t>BaseController</w:t>
       </w:r>
+      <w:proofErr w:type="spellEnd"/>
       <w:r>
         <w:rPr>
           <w:rFonts w:hint="cs"/>
@@ -4074,12 +4175,14 @@
         </w:rPr>
         <w:t xml:space="preserve">فهنا انا عملت ال </w:t>
       </w:r>
+      <w:proofErr w:type="spellStart"/>
       <w:r>
         <w:rPr>
           <w:lang w:bidi="ar-EG"/>
         </w:rPr>
         <w:t>BaseController</w:t>
       </w:r>
+      <w:proofErr w:type="spellEnd"/>
       <w:r>
         <w:rPr>
           <w:rFonts w:hint="cs"/>
@@ -4088,11 +4191,19 @@
         </w:rPr>
         <w:t xml:space="preserve"> والي هو كل الي فيه دلوقتي انه بيجيب ال </w:t>
       </w:r>
-      <w:r>
-        <w:rPr>
-          <w:lang w:bidi="ar-EG"/>
-        </w:rPr>
-        <w:t>get_settings()</w:t>
+      <w:proofErr w:type="spellStart"/>
+      <w:r>
+        <w:rPr>
+          <w:lang w:bidi="ar-EG"/>
+        </w:rPr>
+        <w:t>get_settings</w:t>
+      </w:r>
+      <w:proofErr w:type="spellEnd"/>
+      <w:r>
+        <w:rPr>
+          <w:lang w:bidi="ar-EG"/>
+        </w:rPr>
+        <w:t>()</w:t>
       </w:r>
     </w:p>
     <w:p>
@@ -4162,12 +4273,14 @@
         </w:rPr>
         <w:t xml:space="preserve">وخلينا ال </w:t>
       </w:r>
+      <w:proofErr w:type="spellStart"/>
       <w:r>
         <w:rPr>
           <w:lang w:bidi="ar-EG"/>
         </w:rPr>
         <w:t>DataController</w:t>
       </w:r>
+      <w:proofErr w:type="spellEnd"/>
       <w:r>
         <w:rPr>
           <w:rFonts w:hint="cs"/>
@@ -4267,12 +4380,14 @@
         </w:rPr>
         <w:t xml:space="preserve"> تاخد ال </w:t>
       </w:r>
+      <w:proofErr w:type="spellStart"/>
       <w:r>
         <w:rPr>
           <w:lang w:bidi="ar-EG"/>
         </w:rPr>
         <w:t>uploadfile</w:t>
       </w:r>
+      <w:proofErr w:type="spellEnd"/>
       <w:r>
         <w:rPr>
           <w:rFonts w:hint="cs"/>
@@ -4302,8 +4417,16 @@
         <w:rPr>
           <w:lang w:bidi="ar-EG"/>
         </w:rPr>
-        <w:t>.content_type</w:t>
-      </w:r>
+        <w:t>.</w:t>
+      </w:r>
+      <w:proofErr w:type="spellStart"/>
+      <w:r>
+        <w:rPr>
+          <w:lang w:bidi="ar-EG"/>
+        </w:rPr>
+        <w:t>content_type</w:t>
+      </w:r>
+      <w:proofErr w:type="spellEnd"/>
     </w:p>
     <w:p>
       <w:pPr>
@@ -4871,12 +4994,14 @@
         </w:rPr>
         <w:t xml:space="preserve">فمن ال </w:t>
       </w:r>
+      <w:proofErr w:type="spellStart"/>
       <w:r>
         <w:rPr>
           <w:lang w:bidi="ar-EG"/>
         </w:rPr>
         <w:t>fastapi</w:t>
       </w:r>
+      <w:proofErr w:type="spellEnd"/>
       <w:r>
         <w:rPr>
           <w:rFonts w:hint="cs"/>
@@ -4929,12 +5054,14 @@
         </w:rPr>
         <w:t xml:space="preserve">ومن ال </w:t>
       </w:r>
+      <w:proofErr w:type="spellStart"/>
       <w:r>
         <w:rPr>
           <w:lang w:bidi="ar-EG"/>
         </w:rPr>
         <w:t>fastapi.responses</w:t>
       </w:r>
+      <w:proofErr w:type="spellEnd"/>
       <w:r>
         <w:rPr>
           <w:rFonts w:hint="cs"/>
@@ -4943,12 +5070,14 @@
         </w:rPr>
         <w:t xml:space="preserve"> هنجيب ال </w:t>
       </w:r>
+      <w:proofErr w:type="spellStart"/>
       <w:r>
         <w:rPr>
           <w:lang w:bidi="ar-EG"/>
         </w:rPr>
         <w:t>JSONResponse</w:t>
       </w:r>
+      <w:proofErr w:type="spellEnd"/>
     </w:p>
     <w:p>
       <w:pPr>
@@ -4966,12 +5095,14 @@
         </w:rPr>
         <w:t xml:space="preserve">والي بيكون فيه حاجتين ال </w:t>
       </w:r>
+      <w:proofErr w:type="spellStart"/>
       <w:r>
         <w:rPr>
           <w:lang w:bidi="ar-EG"/>
         </w:rPr>
         <w:t>status_code</w:t>
       </w:r>
+      <w:proofErr w:type="spellEnd"/>
       <w:r>
         <w:rPr>
           <w:rFonts w:hint="cs"/>
@@ -5165,12 +5296,14 @@
         </w:rPr>
         <w:t xml:space="preserve">عاوزين بقي اننا نبدا اننا ناخد ال </w:t>
       </w:r>
+      <w:proofErr w:type="spellStart"/>
       <w:r>
         <w:rPr>
           <w:lang w:bidi="ar-EG"/>
         </w:rPr>
         <w:t>project_id</w:t>
       </w:r>
+      <w:proofErr w:type="spellEnd"/>
       <w:r>
         <w:rPr>
           <w:rFonts w:hint="cs"/>
@@ -5349,8 +5482,16 @@
         <w:rPr>
           <w:lang w:bidi="ar-EG"/>
         </w:rPr>
-        <w:t xml:space="preserve"> ProjectController</w:t>
-      </w:r>
+        <w:t xml:space="preserve"> </w:t>
+      </w:r>
+      <w:proofErr w:type="spellStart"/>
+      <w:r>
+        <w:rPr>
+          <w:lang w:bidi="ar-EG"/>
+        </w:rPr>
+        <w:t>ProjectController</w:t>
+      </w:r>
+      <w:proofErr w:type="spellEnd"/>
       <w:r>
         <w:rPr>
           <w:rFonts w:hint="cs"/>
@@ -5411,12 +5552,14 @@
         </w:rPr>
         <w:t xml:space="preserve"> الجديد بناءا علي ال </w:t>
       </w:r>
+      <w:proofErr w:type="spellStart"/>
       <w:r>
         <w:rPr>
           <w:lang w:bidi="ar-EG"/>
         </w:rPr>
         <w:t>project_id</w:t>
       </w:r>
+      <w:proofErr w:type="spellEnd"/>
     </w:p>
     <w:p>
       <w:pPr>
@@ -5470,12 +5613,14 @@
         </w:rPr>
         <w:t xml:space="preserve">بس عشان ممكن اي حد يبقي يحتاجه بعد كده انا هروح احطه في ال </w:t>
       </w:r>
+      <w:proofErr w:type="spellStart"/>
       <w:r>
         <w:rPr>
           <w:lang w:bidi="ar-EG"/>
         </w:rPr>
         <w:t>BaseController</w:t>
       </w:r>
+      <w:proofErr w:type="spellEnd"/>
     </w:p>
     <w:p>
       <w:pPr>
@@ -5600,12 +5745,14 @@
         </w:rPr>
         <w:t xml:space="preserve"> الي هتكون خاصه ب </w:t>
       </w:r>
+      <w:proofErr w:type="spellStart"/>
       <w:r>
         <w:rPr>
           <w:lang w:bidi="ar-EG"/>
         </w:rPr>
         <w:t>project_id</w:t>
       </w:r>
+      <w:proofErr w:type="spellEnd"/>
     </w:p>
     <w:p>
       <w:pPr>
@@ -5682,12 +5829,14 @@
         <w:lastRenderedPageBreak/>
         <w:t xml:space="preserve">دلوقتي بقي هروح ل </w:t>
       </w:r>
+      <w:proofErr w:type="spellStart"/>
       <w:r>
         <w:rPr>
           <w:lang w:bidi="ar-EG"/>
         </w:rPr>
         <w:t>ProjectController</w:t>
       </w:r>
+      <w:proofErr w:type="spellEnd"/>
     </w:p>
     <w:p>
       <w:pPr>
@@ -5719,12 +5868,14 @@
         </w:rPr>
         <w:t xml:space="preserve"> بتاعت ال </w:t>
       </w:r>
+      <w:proofErr w:type="spellStart"/>
       <w:r>
         <w:rPr>
           <w:lang w:bidi="ar-EG"/>
         </w:rPr>
         <w:t>get_project_path</w:t>
       </w:r>
+      <w:proofErr w:type="spellEnd"/>
     </w:p>
     <w:p>
       <w:pPr>
@@ -5756,12 +5907,14 @@
         </w:rPr>
         <w:t xml:space="preserve"> بتاع ال </w:t>
       </w:r>
+      <w:proofErr w:type="spellStart"/>
       <w:r>
         <w:rPr>
           <w:lang w:bidi="ar-EG"/>
         </w:rPr>
         <w:t>project_id</w:t>
       </w:r>
+      <w:proofErr w:type="spellEnd"/>
       <w:r>
         <w:rPr>
           <w:rFonts w:hint="cs"/>
@@ -6298,6 +6451,7 @@
         </w:rPr>
         <w:t xml:space="preserve"> هتحتاج ملف مكتبه اسمها </w:t>
       </w:r>
+      <w:proofErr w:type="spellStart"/>
       <w:r>
         <w:rPr>
           <w:lang w:bidi="ar-EG"/>
@@ -6310,6 +6464,7 @@
         </w:rPr>
         <w:t>s</w:t>
       </w:r>
+      <w:proofErr w:type="spellEnd"/>
     </w:p>
     <w:p>
       <w:pPr>
@@ -6374,12 +6529,14 @@
         </w:rPr>
         <w:t xml:space="preserve">#وخلي بالك اننا استعملنا </w:t>
       </w:r>
+      <w:proofErr w:type="spellStart"/>
       <w:r>
         <w:rPr>
           <w:lang w:bidi="ar-EG"/>
         </w:rPr>
         <w:t>aiofiles</w:t>
       </w:r>
+      <w:proofErr w:type="spellEnd"/>
       <w:r>
         <w:rPr>
           <w:rFonts w:hint="cs"/>
@@ -6402,12 +6559,14 @@
         </w:rPr>
         <w:t xml:space="preserve"> وبالتالي بتكون مناسبه ل </w:t>
       </w:r>
+      <w:proofErr w:type="spellStart"/>
       <w:r>
         <w:rPr>
           <w:lang w:bidi="ar-EG"/>
         </w:rPr>
         <w:t>fastapi</w:t>
       </w:r>
+      <w:proofErr w:type="spellEnd"/>
     </w:p>
     <w:p>
       <w:pPr>
@@ -6731,12 +6890,14 @@
         </w:rPr>
         <w:t xml:space="preserve">فعملنا كده جوه ال </w:t>
       </w:r>
+      <w:proofErr w:type="spellStart"/>
       <w:r>
         <w:rPr>
           <w:lang w:bidi="ar-EG"/>
         </w:rPr>
         <w:t>DataController</w:t>
       </w:r>
+      <w:proofErr w:type="spellEnd"/>
     </w:p>
     <w:p>
       <w:pPr>
@@ -6921,12 +7082,14 @@
         </w:rPr>
         <w:t xml:space="preserve"> الي بنعمله من خلال </w:t>
       </w:r>
+      <w:proofErr w:type="spellStart"/>
       <w:r>
         <w:rPr>
           <w:lang w:bidi="ar-EG"/>
         </w:rPr>
         <w:t>aiofiles</w:t>
       </w:r>
+      <w:proofErr w:type="spellEnd"/>
     </w:p>
     <w:p>
       <w:pPr>
@@ -7210,7 +7373,21 @@
         <w:rPr>
           <w:lang w:bidi="ar-EG"/>
         </w:rPr>
-        <w:t>.getLogger()</w:t>
+        <w:t>.</w:t>
+      </w:r>
+      <w:proofErr w:type="spellStart"/>
+      <w:r>
+        <w:rPr>
+          <w:lang w:bidi="ar-EG"/>
+        </w:rPr>
+        <w:t>getLogger</w:t>
+      </w:r>
+      <w:proofErr w:type="spellEnd"/>
+      <w:r>
+        <w:rPr>
+          <w:lang w:bidi="ar-EG"/>
+        </w:rPr>
+        <w:t>()</w:t>
       </w:r>
     </w:p>
     <w:p>
@@ -7397,8 +7574,16 @@
         <w:rPr>
           <w:lang w:bidi="ar-EG"/>
         </w:rPr>
-        <w:t>.generate_file_path</w:t>
-      </w:r>
+        <w:t>.</w:t>
+      </w:r>
+      <w:proofErr w:type="spellStart"/>
+      <w:r>
+        <w:rPr>
+          <w:lang w:bidi="ar-EG"/>
+        </w:rPr>
+        <w:t>generate_file_path</w:t>
+      </w:r>
+      <w:proofErr w:type="spellEnd"/>
       <w:r>
         <w:rPr>
           <w:rFonts w:hint="cs"/>
@@ -7407,12 +7592,14 @@
         </w:rPr>
         <w:t xml:space="preserve"> هيرجعلي كمان ال </w:t>
       </w:r>
+      <w:proofErr w:type="spellStart"/>
       <w:r>
         <w:rPr>
           <w:lang w:bidi="ar-EG"/>
         </w:rPr>
         <w:t>file_id</w:t>
       </w:r>
+      <w:proofErr w:type="spellEnd"/>
       <w:r>
         <w:rPr>
           <w:rFonts w:hint="cs"/>
@@ -7687,12 +7874,14 @@
         </w:rPr>
         <w:t xml:space="preserve">تكون وظيفتها انها تاخد ال </w:t>
       </w:r>
+      <w:proofErr w:type="spellStart"/>
       <w:r>
         <w:rPr>
           <w:lang w:bidi="ar-EG"/>
         </w:rPr>
         <w:t>file_id</w:t>
       </w:r>
+      <w:proofErr w:type="spellEnd"/>
     </w:p>
     <w:p>
       <w:pPr>
@@ -7822,12 +8011,14 @@
         </w:rPr>
         <w:t xml:space="preserve">ال </w:t>
       </w:r>
+      <w:proofErr w:type="spellStart"/>
       <w:r>
         <w:rPr>
           <w:lang w:bidi="ar-EG"/>
         </w:rPr>
         <w:t>pydantic</w:t>
       </w:r>
+      <w:proofErr w:type="spellEnd"/>
     </w:p>
     <w:p>
       <w:pPr>
@@ -8226,12 +8417,14 @@
         </w:rPr>
         <w:t xml:space="preserve"> هيدينا ال </w:t>
       </w:r>
+      <w:proofErr w:type="spellStart"/>
       <w:r>
         <w:rPr>
           <w:lang w:bidi="ar-EG"/>
         </w:rPr>
         <w:t>file_id</w:t>
       </w:r>
+      <w:proofErr w:type="spellEnd"/>
       <w:r>
         <w:rPr>
           <w:rFonts w:hint="cs"/>
@@ -8270,12 +8463,14 @@
         </w:rPr>
         <w:t xml:space="preserve"> اسمه</w:t>
       </w:r>
+      <w:proofErr w:type="spellStart"/>
       <w:r>
         <w:rPr>
           <w:lang w:bidi="ar-EG"/>
         </w:rPr>
         <w:t>ProcessController</w:t>
       </w:r>
+      <w:proofErr w:type="spellEnd"/>
     </w:p>
     <w:p>
       <w:pPr>
@@ -8374,12 +8569,14 @@
         </w:rPr>
         <w:t xml:space="preserve"> من </w:t>
       </w:r>
+      <w:proofErr w:type="spellStart"/>
       <w:r>
         <w:rPr>
           <w:lang w:bidi="ar-EG"/>
         </w:rPr>
         <w:t>Langchain</w:t>
       </w:r>
+      <w:proofErr w:type="spellEnd"/>
       <w:r>
         <w:rPr>
           <w:rFonts w:hint="cs"/>
@@ -9009,12 +9206,14 @@
         </w:rPr>
         <w:t xml:space="preserve">وعاوزين اننا نبدا نشتغل علي ال </w:t>
       </w:r>
+      <w:proofErr w:type="spellStart"/>
       <w:r>
         <w:rPr>
           <w:lang w:bidi="ar-EG"/>
         </w:rPr>
         <w:t>mongodb</w:t>
       </w:r>
+      <w:proofErr w:type="spellEnd"/>
     </w:p>
     <w:p>
       <w:pPr>
@@ -9093,12 +9292,14 @@
         </w:rPr>
         <w:t xml:space="preserve">فانا هستعمل دلوقتي ال </w:t>
       </w:r>
+      <w:proofErr w:type="spellStart"/>
       <w:r>
         <w:rPr>
           <w:lang w:bidi="ar-EG"/>
         </w:rPr>
         <w:t>mongodb</w:t>
       </w:r>
+      <w:proofErr w:type="spellEnd"/>
       <w:r>
         <w:rPr>
           <w:rFonts w:hint="cs"/>
@@ -9143,12 +9344,14 @@
         </w:rPr>
         <w:t xml:space="preserve">فهو ده الملف بتاعن الي موجود فيه ال </w:t>
       </w:r>
+      <w:proofErr w:type="spellStart"/>
       <w:r>
         <w:rPr>
           <w:lang w:bidi="ar-EG"/>
         </w:rPr>
         <w:t>mongodb</w:t>
       </w:r>
+      <w:proofErr w:type="spellEnd"/>
     </w:p>
     <w:p>
       <w:pPr>
@@ -9216,12 +9419,14 @@
         </w:rPr>
         <w:t xml:space="preserve">بعد كده روحنا حطينا ال </w:t>
       </w:r>
+      <w:proofErr w:type="spellStart"/>
       <w:r>
         <w:rPr>
           <w:lang w:bidi="ar-EG"/>
         </w:rPr>
         <w:t>url</w:t>
       </w:r>
+      <w:proofErr w:type="spellEnd"/>
       <w:r>
         <w:rPr>
           <w:rFonts w:hint="cs"/>
@@ -9349,12 +9554,14 @@
         </w:rPr>
         <w:t xml:space="preserve"> علي ال </w:t>
       </w:r>
+      <w:proofErr w:type="spellStart"/>
       <w:r>
         <w:rPr>
           <w:lang w:bidi="ar-EG"/>
         </w:rPr>
         <w:t>monogdb</w:t>
       </w:r>
+      <w:proofErr w:type="spellEnd"/>
     </w:p>
     <w:p>
       <w:pPr>
@@ -9424,12 +9631,14 @@
         </w:rPr>
         <w:t xml:space="preserve"> لان هو ده الوسيط ما بين ال </w:t>
       </w:r>
+      <w:proofErr w:type="spellStart"/>
       <w:r>
         <w:rPr>
           <w:lang w:bidi="ar-EG"/>
         </w:rPr>
         <w:t>mongodb</w:t>
       </w:r>
+      <w:proofErr w:type="spellEnd"/>
       <w:r>
         <w:rPr>
           <w:rFonts w:hint="cs"/>
@@ -9738,13 +9947,13 @@
       <w:pPr>
         <w:bidi/>
         <w:rPr>
-          <w:rtl/>
           <w:lang w:bidi="ar-EG"/>
         </w:rPr>
       </w:pPr>
       <w:r>
         <w:rPr>
           <w:rFonts w:cs="Arial"/>
+          <w:noProof/>
           <w:rtl/>
           <w:lang w:bidi="ar-EG"/>
         </w:rPr>
@@ -9784,6 +9993,2839 @@
           </wp:inline>
         </w:drawing>
       </w:r>
+    </w:p>
+    <w:p>
+      <w:pPr>
+        <w:bidi/>
+        <w:rPr>
+          <w:lang w:bidi="ar-EG"/>
+        </w:rPr>
+      </w:pPr>
+    </w:p>
+    <w:p>
+      <w:pPr>
+        <w:bidi/>
+        <w:rPr>
+          <w:lang w:bidi="ar-EG"/>
+        </w:rPr>
+      </w:pPr>
+    </w:p>
+    <w:p>
+      <w:pPr>
+        <w:bidi/>
+        <w:rPr>
+          <w:lang w:bidi="ar-EG"/>
+        </w:rPr>
+      </w:pPr>
+    </w:p>
+    <w:p>
+      <w:pPr>
+        <w:bidi/>
+        <w:rPr>
+          <w:lang w:bidi="ar-EG"/>
+        </w:rPr>
+      </w:pPr>
+    </w:p>
+    <w:p>
+      <w:pPr>
+        <w:bidi/>
+        <w:rPr>
+          <w:lang w:bidi="ar-EG"/>
+        </w:rPr>
+      </w:pPr>
+    </w:p>
+    <w:p>
+      <w:pPr>
+        <w:bidi/>
+        <w:rPr>
+          <w:lang w:bidi="ar-EG"/>
+        </w:rPr>
+      </w:pPr>
+    </w:p>
+    <w:p>
+      <w:pPr>
+        <w:bidi/>
+        <w:rPr>
+          <w:lang w:bidi="ar-EG"/>
+        </w:rPr>
+      </w:pPr>
+    </w:p>
+    <w:p>
+      <w:pPr>
+        <w:bidi/>
+        <w:rPr>
+          <w:lang w:bidi="ar-EG"/>
+        </w:rPr>
+      </w:pPr>
+    </w:p>
+    <w:p>
+      <w:pPr>
+        <w:bidi/>
+        <w:rPr>
+          <w:lang w:bidi="ar-EG"/>
+        </w:rPr>
+      </w:pPr>
+    </w:p>
+    <w:p>
+      <w:pPr>
+        <w:bidi/>
+        <w:rPr>
+          <w:lang w:bidi="ar-EG"/>
+        </w:rPr>
+      </w:pPr>
+    </w:p>
+    <w:p>
+      <w:pPr>
+        <w:bidi/>
+        <w:rPr>
+          <w:lang w:bidi="ar-EG"/>
+        </w:rPr>
+      </w:pPr>
+    </w:p>
+    <w:p>
+      <w:pPr>
+        <w:bidi/>
+        <w:rPr>
+          <w:lang w:bidi="ar-EG"/>
+        </w:rPr>
+      </w:pPr>
+    </w:p>
+    <w:p>
+      <w:pPr>
+        <w:bidi/>
+        <w:rPr>
+          <w:lang w:bidi="ar-EG"/>
+        </w:rPr>
+      </w:pPr>
+    </w:p>
+    <w:p>
+      <w:pPr>
+        <w:bidi/>
+        <w:rPr>
+          <w:lang w:bidi="ar-EG"/>
+        </w:rPr>
+      </w:pPr>
+    </w:p>
+    <w:p>
+      <w:pPr>
+        <w:bidi/>
+        <w:rPr>
+          <w:lang w:bidi="ar-EG"/>
+        </w:rPr>
+      </w:pPr>
+    </w:p>
+    <w:p>
+      <w:pPr>
+        <w:bidi/>
+        <w:rPr>
+          <w:lang w:bidi="ar-EG"/>
+        </w:rPr>
+      </w:pPr>
+      <w:r>
+        <w:rPr>
+          <w:rFonts w:hint="cs"/>
+          <w:rtl/>
+          <w:lang w:bidi="ar-EG"/>
+        </w:rPr>
+        <w:lastRenderedPageBreak/>
+        <w:t xml:space="preserve">هنبدا دلوقتي اننا نشتغل علي اننا نخزن ال </w:t>
+      </w:r>
+      <w:r>
+        <w:rPr>
+          <w:lang w:bidi="ar-EG"/>
+        </w:rPr>
+        <w:t>Data</w:t>
+      </w:r>
+      <w:r>
+        <w:rPr>
+          <w:rFonts w:hint="cs"/>
+          <w:rtl/>
+          <w:lang w:bidi="ar-EG"/>
+        </w:rPr>
+        <w:t xml:space="preserve"> بتاعتنا في </w:t>
+      </w:r>
+      <w:r>
+        <w:rPr>
+          <w:lang w:bidi="ar-EG"/>
+        </w:rPr>
+        <w:t>Database</w:t>
+      </w:r>
+    </w:p>
+    <w:p>
+      <w:pPr>
+        <w:bidi/>
+        <w:rPr>
+          <w:rtl/>
+          <w:lang w:bidi="ar-EG"/>
+        </w:rPr>
+      </w:pPr>
+      <w:r>
+        <w:rPr>
+          <w:rFonts w:hint="cs"/>
+          <w:rtl/>
+          <w:lang w:bidi="ar-EG"/>
+        </w:rPr>
+        <w:t xml:space="preserve">فاول حاجه عملناها اي اننا عملنا </w:t>
+      </w:r>
+      <w:r>
+        <w:rPr>
+          <w:lang w:bidi="ar-EG"/>
+        </w:rPr>
+        <w:t>file</w:t>
+      </w:r>
+      <w:r>
+        <w:rPr>
+          <w:rFonts w:hint="cs"/>
+          <w:rtl/>
+          <w:lang w:bidi="ar-EG"/>
+        </w:rPr>
+        <w:t xml:space="preserve"> اسمه </w:t>
+      </w:r>
+      <w:r>
+        <w:rPr>
+          <w:lang w:bidi="ar-EG"/>
+        </w:rPr>
+        <w:t>BaseDataModel.py</w:t>
+      </w:r>
+    </w:p>
+    <w:p>
+      <w:pPr>
+        <w:bidi/>
+        <w:rPr>
+          <w:rtl/>
+          <w:lang w:bidi="ar-EG"/>
+        </w:rPr>
+      </w:pPr>
+      <w:r>
+        <w:rPr>
+          <w:rFonts w:hint="cs"/>
+          <w:rtl/>
+          <w:lang w:bidi="ar-EG"/>
+        </w:rPr>
+        <w:t xml:space="preserve">وده الي هيكون فيه المعلومات الاساسيه الي باقي ال </w:t>
+      </w:r>
+      <w:r>
+        <w:rPr>
+          <w:lang w:bidi="ar-EG"/>
+        </w:rPr>
+        <w:t>files</w:t>
+      </w:r>
+      <w:r>
+        <w:rPr>
+          <w:rFonts w:hint="cs"/>
+          <w:rtl/>
+          <w:lang w:bidi="ar-EG"/>
+        </w:rPr>
+        <w:t xml:space="preserve"> هيورثوها منه</w:t>
+      </w:r>
+    </w:p>
+    <w:p>
+      <w:pPr>
+        <w:bidi/>
+        <w:rPr>
+          <w:lang w:bidi="ar-EG"/>
+        </w:rPr>
+      </w:pPr>
+      <w:r>
+        <w:rPr>
+          <w:rFonts w:hint="cs"/>
+          <w:rtl/>
+          <w:lang w:bidi="ar-EG"/>
+        </w:rPr>
+        <w:t xml:space="preserve">فانا هديله هنا ال </w:t>
+      </w:r>
+      <w:r>
+        <w:rPr>
+          <w:lang w:bidi="ar-EG"/>
+        </w:rPr>
+        <w:t>Database</w:t>
+      </w:r>
+      <w:r>
+        <w:rPr>
+          <w:rFonts w:hint="cs"/>
+          <w:rtl/>
+          <w:lang w:bidi="ar-EG"/>
+        </w:rPr>
+        <w:t xml:space="preserve"> ك </w:t>
+      </w:r>
+      <w:r>
+        <w:rPr>
+          <w:lang w:bidi="ar-EG"/>
+        </w:rPr>
+        <w:t>parameter</w:t>
+      </w:r>
+      <w:r>
+        <w:rPr>
+          <w:rFonts w:hint="cs"/>
+          <w:rtl/>
+          <w:lang w:bidi="ar-EG"/>
+        </w:rPr>
+        <w:t xml:space="preserve"> دايما عشان الي يورث منه يكون شايفها بردو</w:t>
+      </w:r>
+    </w:p>
+    <w:p>
+      <w:pPr>
+        <w:bidi/>
+        <w:rPr>
+          <w:lang w:bidi="ar-EG"/>
+        </w:rPr>
+      </w:pPr>
+      <w:r>
+        <w:rPr>
+          <w:rFonts w:cs="Arial"/>
+          <w:noProof/>
+          <w:rtl/>
+          <w:lang w:bidi="ar-EG"/>
+        </w:rPr>
+        <w:drawing>
+          <wp:inline distT="0" distB="0" distL="0" distR="0" wp14:anchorId="09FFF207" wp14:editId="3E6BDEC3">
+            <wp:extent cx="4972050" cy="2048256"/>
+            <wp:effectExtent l="0" t="0" r="0" b="9525"/>
+            <wp:docPr id="44" name="Picture 44"/>
+            <wp:cNvGraphicFramePr>
+              <a:graphicFrameLocks xmlns:a="http://schemas.openxmlformats.org/drawingml/2006/main" noChangeAspect="1"/>
+            </wp:cNvGraphicFramePr>
+            <a:graphic xmlns:a="http://schemas.openxmlformats.org/drawingml/2006/main">
+              <a:graphicData uri="http://schemas.openxmlformats.org/drawingml/2006/picture">
+                <pic:pic xmlns:pic="http://schemas.openxmlformats.org/drawingml/2006/picture">
+                  <pic:nvPicPr>
+                    <pic:cNvPr id="1" name=""/>
+                    <pic:cNvPicPr/>
+                  </pic:nvPicPr>
+                  <pic:blipFill rotWithShape="1">
+                    <a:blip r:embed="rId48"/>
+                    <a:srcRect b="24547"/>
+                    <a:stretch/>
+                  </pic:blipFill>
+                  <pic:spPr bwMode="auto">
+                    <a:xfrm>
+                      <a:off x="0" y="0"/>
+                      <a:ext cx="4972744" cy="2048542"/>
+                    </a:xfrm>
+                    <a:prstGeom prst="rect">
+                      <a:avLst/>
+                    </a:prstGeom>
+                    <a:ln>
+                      <a:noFill/>
+                    </a:ln>
+                    <a:extLst>
+                      <a:ext uri="{53640926-AAD7-44D8-BBD7-CCE9431645EC}">
+                        <a14:shadowObscured xmlns:a14="http://schemas.microsoft.com/office/drawing/2010/main"/>
+                      </a:ext>
+                    </a:extLst>
+                  </pic:spPr>
+                </pic:pic>
+              </a:graphicData>
+            </a:graphic>
+          </wp:inline>
+        </w:drawing>
+      </w:r>
+    </w:p>
+    <w:p>
+      <w:pPr>
+        <w:bidi/>
+        <w:rPr>
+          <w:lang w:bidi="ar-EG"/>
+        </w:rPr>
+      </w:pPr>
+    </w:p>
+    <w:p>
+      <w:pPr>
+        <w:bidi/>
+        <w:rPr>
+          <w:lang w:bidi="ar-EG"/>
+        </w:rPr>
+      </w:pPr>
+      <w:r>
+        <w:rPr>
+          <w:rFonts w:hint="cs"/>
+          <w:rtl/>
+          <w:lang w:bidi="ar-EG"/>
+        </w:rPr>
+        <w:t xml:space="preserve">بعد كده هنبدا اننا نعمل </w:t>
+      </w:r>
+      <w:r>
+        <w:rPr>
+          <w:lang w:bidi="ar-EG"/>
+        </w:rPr>
+        <w:t>file</w:t>
+      </w:r>
+      <w:r>
+        <w:rPr>
+          <w:rFonts w:hint="cs"/>
+          <w:rtl/>
+          <w:lang w:bidi="ar-EG"/>
+        </w:rPr>
+        <w:t xml:space="preserve"> خاص ب </w:t>
+      </w:r>
+      <w:r>
+        <w:rPr>
+          <w:lang w:bidi="ar-EG"/>
+        </w:rPr>
+        <w:t xml:space="preserve"> collection</w:t>
+      </w:r>
+      <w:r>
+        <w:rPr>
+          <w:rFonts w:hint="cs"/>
+          <w:rtl/>
+          <w:lang w:bidi="ar-EG"/>
+        </w:rPr>
+        <w:t xml:space="preserve"> بتاع ال </w:t>
+      </w:r>
+      <w:r>
+        <w:rPr>
+          <w:lang w:bidi="ar-EG"/>
+        </w:rPr>
+        <w:t>project</w:t>
+      </w:r>
+    </w:p>
+    <w:p>
+      <w:pPr>
+        <w:bidi/>
+        <w:rPr>
+          <w:lang w:bidi="ar-EG"/>
+        </w:rPr>
+      </w:pPr>
+      <w:r>
+        <w:rPr>
+          <w:rFonts w:hint="cs"/>
+          <w:rtl/>
+          <w:lang w:bidi="ar-EG"/>
+        </w:rPr>
+        <w:t>ودي اول حاجه احنا عملناها في الملف</w:t>
+      </w:r>
+      <w:r>
+        <w:rPr>
+          <w:rFonts w:hint="cs"/>
+          <w:rtl/>
+          <w:lang w:bidi="ar-EG"/>
+        </w:rPr>
+        <w:t xml:space="preserve"> والي خليناه انه يورث من الاب ويديله ال </w:t>
+      </w:r>
+      <w:proofErr w:type="spellStart"/>
+      <w:r>
+        <w:rPr>
+          <w:lang w:bidi="ar-EG"/>
+        </w:rPr>
+        <w:t>db_client</w:t>
+      </w:r>
+      <w:proofErr w:type="spellEnd"/>
+    </w:p>
+    <w:p>
+      <w:pPr>
+        <w:bidi/>
+        <w:rPr>
+          <w:lang w:bidi="ar-EG"/>
+        </w:rPr>
+      </w:pPr>
+      <w:r>
+        <w:rPr>
+          <w:rFonts w:cs="Arial"/>
+          <w:rtl/>
+          <w:lang w:bidi="ar-EG"/>
+        </w:rPr>
+        <w:drawing>
+          <wp:inline distT="0" distB="0" distL="0" distR="0" wp14:anchorId="78C273A6" wp14:editId="56DBAA47">
+            <wp:extent cx="4534533" cy="1676634"/>
+            <wp:effectExtent l="0" t="0" r="0" b="0"/>
+            <wp:docPr id="46" name="Picture 46"/>
+            <wp:cNvGraphicFramePr>
+              <a:graphicFrameLocks xmlns:a="http://schemas.openxmlformats.org/drawingml/2006/main" noChangeAspect="1"/>
+            </wp:cNvGraphicFramePr>
+            <a:graphic xmlns:a="http://schemas.openxmlformats.org/drawingml/2006/main">
+              <a:graphicData uri="http://schemas.openxmlformats.org/drawingml/2006/picture">
+                <pic:pic xmlns:pic="http://schemas.openxmlformats.org/drawingml/2006/picture">
+                  <pic:nvPicPr>
+                    <pic:cNvPr id="1" name=""/>
+                    <pic:cNvPicPr/>
+                  </pic:nvPicPr>
+                  <pic:blipFill>
+                    <a:blip r:embed="rId49"/>
+                    <a:stretch>
+                      <a:fillRect/>
+                    </a:stretch>
+                  </pic:blipFill>
+                  <pic:spPr>
+                    <a:xfrm>
+                      <a:off x="0" y="0"/>
+                      <a:ext cx="4534533" cy="1676634"/>
+                    </a:xfrm>
+                    <a:prstGeom prst="rect">
+                      <a:avLst/>
+                    </a:prstGeom>
+                  </pic:spPr>
+                </pic:pic>
+              </a:graphicData>
+            </a:graphic>
+          </wp:inline>
+        </w:drawing>
+      </w:r>
+    </w:p>
+    <w:p>
+      <w:pPr>
+        <w:bidi/>
+        <w:rPr>
+          <w:lang w:bidi="ar-EG"/>
+        </w:rPr>
+      </w:pPr>
+      <w:r>
+        <w:rPr>
+          <w:rFonts w:hint="cs"/>
+          <w:rtl/>
+          <w:lang w:bidi="ar-EG"/>
+        </w:rPr>
+        <w:t xml:space="preserve">بعد كده روحنا عملنا ملف ل </w:t>
+      </w:r>
+      <w:r>
+        <w:rPr>
+          <w:lang w:bidi="ar-EG"/>
+        </w:rPr>
+        <w:t>Enums</w:t>
+      </w:r>
+      <w:r>
+        <w:rPr>
+          <w:rFonts w:hint="cs"/>
+          <w:rtl/>
+          <w:lang w:bidi="ar-EG"/>
+        </w:rPr>
+        <w:t xml:space="preserve"> الي هنستعملها هنا وسمينا الملف ب </w:t>
+      </w:r>
+      <w:r>
+        <w:rPr>
+          <w:lang w:bidi="ar-EG"/>
+        </w:rPr>
+        <w:t>DataBaseEnum.py</w:t>
+      </w:r>
+    </w:p>
+    <w:p>
+      <w:pPr>
+        <w:bidi/>
+        <w:rPr>
+          <w:lang w:bidi="ar-EG"/>
+        </w:rPr>
+      </w:pPr>
+      <w:r>
+        <w:rPr>
+          <w:rFonts w:cs="Arial"/>
+          <w:rtl/>
+          <w:lang w:bidi="ar-EG"/>
+        </w:rPr>
+        <w:drawing>
+          <wp:inline distT="0" distB="0" distL="0" distR="0" wp14:anchorId="68BD03A1" wp14:editId="36412A34">
+            <wp:extent cx="4077269" cy="1448002"/>
+            <wp:effectExtent l="0" t="0" r="0" b="0"/>
+            <wp:docPr id="47" name="Picture 47"/>
+            <wp:cNvGraphicFramePr>
+              <a:graphicFrameLocks xmlns:a="http://schemas.openxmlformats.org/drawingml/2006/main" noChangeAspect="1"/>
+            </wp:cNvGraphicFramePr>
+            <a:graphic xmlns:a="http://schemas.openxmlformats.org/drawingml/2006/main">
+              <a:graphicData uri="http://schemas.openxmlformats.org/drawingml/2006/picture">
+                <pic:pic xmlns:pic="http://schemas.openxmlformats.org/drawingml/2006/picture">
+                  <pic:nvPicPr>
+                    <pic:cNvPr id="1" name=""/>
+                    <pic:cNvPicPr/>
+                  </pic:nvPicPr>
+                  <pic:blipFill>
+                    <a:blip r:embed="rId50"/>
+                    <a:stretch>
+                      <a:fillRect/>
+                    </a:stretch>
+                  </pic:blipFill>
+                  <pic:spPr>
+                    <a:xfrm>
+                      <a:off x="0" y="0"/>
+                      <a:ext cx="4077269" cy="1448002"/>
+                    </a:xfrm>
+                    <a:prstGeom prst="rect">
+                      <a:avLst/>
+                    </a:prstGeom>
+                  </pic:spPr>
+                </pic:pic>
+              </a:graphicData>
+            </a:graphic>
+          </wp:inline>
+        </w:drawing>
+      </w:r>
+    </w:p>
+    <w:p>
+      <w:pPr>
+        <w:bidi/>
+        <w:rPr>
+          <w:lang w:bidi="ar-EG"/>
+        </w:rPr>
+      </w:pPr>
+    </w:p>
+    <w:p>
+      <w:pPr>
+        <w:bidi/>
+        <w:rPr>
+          <w:lang w:bidi="ar-EG"/>
+        </w:rPr>
+      </w:pPr>
+      <w:r>
+        <w:rPr>
+          <w:rFonts w:hint="cs"/>
+          <w:rtl/>
+          <w:lang w:bidi="ar-EG"/>
+        </w:rPr>
+        <w:lastRenderedPageBreak/>
+        <w:t xml:space="preserve">دلوقتي بقي رجوعا ل </w:t>
+      </w:r>
+      <w:proofErr w:type="spellStart"/>
+      <w:r>
+        <w:rPr>
+          <w:lang w:bidi="ar-EG"/>
+        </w:rPr>
+        <w:t>ProjectModel</w:t>
+      </w:r>
+      <w:proofErr w:type="spellEnd"/>
+    </w:p>
+    <w:p>
+      <w:pPr>
+        <w:bidi/>
+        <w:rPr>
+          <w:rtl/>
+          <w:lang w:bidi="ar-EG"/>
+        </w:rPr>
+      </w:pPr>
+    </w:p>
+    <w:p>
+      <w:pPr>
+        <w:bidi/>
+        <w:rPr>
+          <w:lang w:bidi="ar-EG"/>
+        </w:rPr>
+      </w:pPr>
+      <w:r>
+        <w:rPr>
+          <w:rFonts w:hint="cs"/>
+          <w:rtl/>
+          <w:lang w:bidi="ar-EG"/>
+        </w:rPr>
+        <w:t xml:space="preserve">احنا عملنا فيه </w:t>
+      </w:r>
+      <w:r>
+        <w:rPr>
+          <w:lang w:bidi="ar-EG"/>
+        </w:rPr>
+        <w:t>3 functions</w:t>
+      </w:r>
+    </w:p>
+    <w:p>
+      <w:pPr>
+        <w:bidi/>
+        <w:rPr>
+          <w:lang w:bidi="ar-EG"/>
+        </w:rPr>
+      </w:pPr>
+      <w:r>
+        <w:rPr>
+          <w:rFonts w:hint="cs"/>
+          <w:rtl/>
+          <w:lang w:bidi="ar-EG"/>
+        </w:rPr>
+        <w:t xml:space="preserve">واحده انها تعمل </w:t>
+      </w:r>
+      <w:proofErr w:type="spellStart"/>
+      <w:r>
+        <w:rPr>
+          <w:lang w:bidi="ar-EG"/>
+        </w:rPr>
+        <w:t>create_project</w:t>
+      </w:r>
+      <w:proofErr w:type="spellEnd"/>
+      <w:r>
+        <w:rPr>
+          <w:rFonts w:hint="cs"/>
+          <w:rtl/>
+          <w:lang w:bidi="ar-EG"/>
+        </w:rPr>
+        <w:t xml:space="preserve"> في ال </w:t>
+      </w:r>
+      <w:proofErr w:type="spellStart"/>
+      <w:r>
+        <w:rPr>
+          <w:lang w:bidi="ar-EG"/>
+        </w:rPr>
+        <w:t>monog</w:t>
+      </w:r>
+      <w:proofErr w:type="spellEnd"/>
+    </w:p>
+    <w:p>
+      <w:pPr>
+        <w:bidi/>
+        <w:rPr>
+          <w:lang w:bidi="ar-EG"/>
+        </w:rPr>
+      </w:pPr>
+      <w:r>
+        <w:rPr>
+          <w:rFonts w:hint="cs"/>
+          <w:rtl/>
+          <w:lang w:bidi="ar-EG"/>
+        </w:rPr>
+        <w:t xml:space="preserve">والتانيه ه </w:t>
+      </w:r>
+      <w:proofErr w:type="spellStart"/>
+      <w:r>
+        <w:rPr>
+          <w:lang w:bidi="ar-EG"/>
+        </w:rPr>
+        <w:t>get_project_or_create_one</w:t>
+      </w:r>
+      <w:proofErr w:type="spellEnd"/>
+      <w:r>
+        <w:rPr>
+          <w:lang w:bidi="ar-EG"/>
+        </w:rPr>
+        <w:t>()</w:t>
+      </w:r>
+    </w:p>
+    <w:p>
+      <w:pPr>
+        <w:bidi/>
+        <w:rPr>
+          <w:rtl/>
+          <w:lang w:bidi="ar-EG"/>
+        </w:rPr>
+      </w:pPr>
+      <w:r>
+        <w:rPr>
+          <w:rFonts w:hint="cs"/>
+          <w:rtl/>
+          <w:lang w:bidi="ar-EG"/>
+        </w:rPr>
+        <w:t xml:space="preserve">والي هي عبارة عن انها بترجعلك ال </w:t>
+      </w:r>
+      <w:r>
+        <w:rPr>
+          <w:lang w:bidi="ar-EG"/>
+        </w:rPr>
+        <w:t>project</w:t>
+      </w:r>
+      <w:r>
+        <w:rPr>
+          <w:rFonts w:hint="cs"/>
+          <w:rtl/>
+          <w:lang w:bidi="ar-EG"/>
+        </w:rPr>
+        <w:t xml:space="preserve"> لو موجود لو مش موجود هو هيعملهولك</w:t>
+      </w:r>
+    </w:p>
+    <w:p>
+      <w:pPr>
+        <w:bidi/>
+        <w:rPr>
+          <w:rtl/>
+          <w:lang w:bidi="ar-EG"/>
+        </w:rPr>
+      </w:pPr>
+    </w:p>
+    <w:p>
+      <w:pPr>
+        <w:bidi/>
+        <w:rPr>
+          <w:lang w:bidi="ar-EG"/>
+        </w:rPr>
+      </w:pPr>
+      <w:r>
+        <w:rPr>
+          <w:rFonts w:hint="cs"/>
+          <w:rtl/>
+          <w:lang w:bidi="ar-EG"/>
+        </w:rPr>
+        <w:t xml:space="preserve">اخر واحده بقي هي ال </w:t>
+      </w:r>
+      <w:proofErr w:type="spellStart"/>
+      <w:r>
+        <w:rPr>
+          <w:lang w:bidi="ar-EG"/>
+        </w:rPr>
+        <w:t>get_all_projects</w:t>
+      </w:r>
+      <w:proofErr w:type="spellEnd"/>
+      <w:r>
+        <w:rPr>
+          <w:lang w:bidi="ar-EG"/>
+        </w:rPr>
+        <w:t>()</w:t>
+      </w:r>
+    </w:p>
+    <w:p>
+      <w:pPr>
+        <w:bidi/>
+        <w:rPr>
+          <w:rtl/>
+          <w:lang w:bidi="ar-EG"/>
+        </w:rPr>
+      </w:pPr>
+      <w:r>
+        <w:rPr>
+          <w:rFonts w:hint="cs"/>
+          <w:rtl/>
+          <w:lang w:bidi="ar-EG"/>
+        </w:rPr>
+        <w:t xml:space="preserve">ودي الي استعملنا فيها ال </w:t>
+      </w:r>
+      <w:r>
+        <w:rPr>
+          <w:lang w:bidi="ar-EG"/>
+        </w:rPr>
+        <w:t>pagination</w:t>
+      </w:r>
+      <w:r>
+        <w:rPr>
+          <w:rFonts w:hint="cs"/>
+          <w:rtl/>
+          <w:lang w:bidi="ar-EG"/>
+        </w:rPr>
+        <w:t xml:space="preserve"> عشان لو عنديي عدد كبير من ال </w:t>
+      </w:r>
+      <w:r>
+        <w:rPr>
+          <w:lang w:bidi="ar-EG"/>
+        </w:rPr>
+        <w:t>documents</w:t>
+      </w:r>
+      <w:r>
+        <w:rPr>
+          <w:rFonts w:hint="cs"/>
+          <w:rtl/>
+          <w:lang w:bidi="ar-EG"/>
+        </w:rPr>
+        <w:t xml:space="preserve"> وليكن </w:t>
+      </w:r>
+      <w:r>
+        <w:rPr>
+          <w:lang w:bidi="ar-EG"/>
+        </w:rPr>
+        <w:t>1000</w:t>
+      </w:r>
+      <w:r>
+        <w:rPr>
+          <w:rFonts w:hint="cs"/>
+          <w:rtl/>
+          <w:lang w:bidi="ar-EG"/>
+        </w:rPr>
+        <w:t xml:space="preserve"> ميرجعوش كلهم مره واحده</w:t>
+      </w:r>
+    </w:p>
+    <w:p>
+      <w:pPr>
+        <w:bidi/>
+        <w:rPr>
+          <w:rtl/>
+          <w:lang w:bidi="ar-EG"/>
+        </w:rPr>
+      </w:pPr>
+      <w:r>
+        <w:rPr>
+          <w:noProof/>
+        </w:rPr>
+        <w:drawing>
+          <wp:inline distT="0" distB="0" distL="0" distR="0" wp14:anchorId="54598AD7" wp14:editId="5A91B7AD">
+            <wp:extent cx="3901965" cy="5629157"/>
+            <wp:effectExtent l="0" t="0" r="3810" b="0"/>
+            <wp:docPr id="48" name="Picture 48"/>
+            <wp:cNvGraphicFramePr>
+              <a:graphicFrameLocks xmlns:a="http://schemas.openxmlformats.org/drawingml/2006/main" noChangeAspect="1"/>
+            </wp:cNvGraphicFramePr>
+            <a:graphic xmlns:a="http://schemas.openxmlformats.org/drawingml/2006/main">
+              <a:graphicData uri="http://schemas.openxmlformats.org/drawingml/2006/picture">
+                <pic:pic xmlns:pic="http://schemas.openxmlformats.org/drawingml/2006/picture">
+                  <pic:nvPicPr>
+                    <pic:cNvPr id="0" name="Picture 1"/>
+                    <pic:cNvPicPr>
+                      <a:picLocks noChangeAspect="1" noChangeArrowheads="1"/>
+                    </pic:cNvPicPr>
+                  </pic:nvPicPr>
+                  <pic:blipFill rotWithShape="1">
+                    <a:blip r:embed="rId51" cstate="print">
+                      <a:extLst>
+                        <a:ext uri="{28A0092B-C50C-407E-A947-70E740481C1C}">
+                          <a14:useLocalDpi xmlns:a14="http://schemas.microsoft.com/office/drawing/2010/main" val="0"/>
+                        </a:ext>
+                      </a:extLst>
+                    </a:blip>
+                    <a:srcRect l="8490" t="6556" r="5374" b="3994"/>
+                    <a:stretch/>
+                  </pic:blipFill>
+                  <pic:spPr bwMode="auto">
+                    <a:xfrm>
+                      <a:off x="0" y="0"/>
+                      <a:ext cx="3910143" cy="5640955"/>
+                    </a:xfrm>
+                    <a:prstGeom prst="rect">
+                      <a:avLst/>
+                    </a:prstGeom>
+                    <a:noFill/>
+                    <a:ln>
+                      <a:noFill/>
+                    </a:ln>
+                    <a:extLst>
+                      <a:ext uri="{53640926-AAD7-44D8-BBD7-CCE9431645EC}">
+                        <a14:shadowObscured xmlns:a14="http://schemas.microsoft.com/office/drawing/2010/main"/>
+                      </a:ext>
+                    </a:extLst>
+                  </pic:spPr>
+                </pic:pic>
+              </a:graphicData>
+            </a:graphic>
+          </wp:inline>
+        </w:drawing>
+      </w:r>
+    </w:p>
+    <w:p>
+      <w:pPr>
+        <w:bidi/>
+        <w:rPr>
+          <w:lang w:bidi="ar-EG"/>
+        </w:rPr>
+      </w:pPr>
+      <w:r>
+        <w:rPr>
+          <w:rFonts w:hint="cs"/>
+          <w:rtl/>
+          <w:lang w:bidi="ar-EG"/>
+        </w:rPr>
+        <w:lastRenderedPageBreak/>
+        <w:t xml:space="preserve">بعد كده رجعنا ل </w:t>
+      </w:r>
+      <w:r>
+        <w:rPr>
+          <w:lang w:bidi="ar-EG"/>
+        </w:rPr>
+        <w:t>route</w:t>
+      </w:r>
+      <w:r>
+        <w:rPr>
+          <w:rFonts w:hint="cs"/>
+          <w:rtl/>
+          <w:lang w:bidi="ar-EG"/>
+        </w:rPr>
+        <w:t xml:space="preserve"> الي هو ال </w:t>
+      </w:r>
+      <w:r>
+        <w:rPr>
+          <w:lang w:bidi="ar-EG"/>
+        </w:rPr>
+        <w:t>data</w:t>
+      </w:r>
+      <w:r>
+        <w:rPr>
+          <w:rFonts w:hint="cs"/>
+          <w:rtl/>
+          <w:lang w:bidi="ar-EG"/>
+        </w:rPr>
+        <w:t xml:space="preserve"> عشان نستعمل ال </w:t>
+      </w:r>
+      <w:r>
+        <w:rPr>
+          <w:lang w:bidi="ar-EG"/>
+        </w:rPr>
+        <w:t>functions</w:t>
+      </w:r>
+      <w:r>
+        <w:rPr>
+          <w:rFonts w:hint="cs"/>
+          <w:rtl/>
+          <w:lang w:bidi="ar-EG"/>
+        </w:rPr>
+        <w:t xml:space="preserve"> دي ونبدا اننا نضيف ال </w:t>
+      </w:r>
+      <w:r>
+        <w:rPr>
+          <w:lang w:bidi="ar-EG"/>
+        </w:rPr>
+        <w:t>projects</w:t>
+      </w:r>
+    </w:p>
+    <w:p>
+      <w:pPr>
+        <w:bidi/>
+        <w:rPr>
+          <w:rtl/>
+          <w:lang w:bidi="ar-EG"/>
+        </w:rPr>
+      </w:pPr>
+    </w:p>
+    <w:p>
+      <w:pPr>
+        <w:bidi/>
+        <w:rPr>
+          <w:rtl/>
+          <w:lang w:bidi="ar-EG"/>
+        </w:rPr>
+      </w:pPr>
+      <w:r>
+        <w:rPr>
+          <w:rFonts w:hint="cs"/>
+          <w:rtl/>
+          <w:lang w:bidi="ar-EG"/>
+        </w:rPr>
+        <w:t xml:space="preserve">فاول حاجه لازم اننا نعمل </w:t>
+      </w:r>
+      <w:r>
+        <w:rPr>
+          <w:lang w:bidi="ar-EG"/>
+        </w:rPr>
+        <w:t>Request</w:t>
+      </w:r>
+      <w:r>
+        <w:rPr>
+          <w:rFonts w:hint="cs"/>
+          <w:rtl/>
+          <w:lang w:bidi="ar-EG"/>
+        </w:rPr>
+        <w:t xml:space="preserve"> علي ال </w:t>
+      </w:r>
+      <w:proofErr w:type="spellStart"/>
+      <w:r>
+        <w:rPr>
+          <w:lang w:bidi="ar-EG"/>
+        </w:rPr>
+        <w:t>db_client</w:t>
+      </w:r>
+      <w:proofErr w:type="spellEnd"/>
+    </w:p>
+    <w:p>
+      <w:pPr>
+        <w:bidi/>
+        <w:rPr>
+          <w:lang w:bidi="ar-EG"/>
+        </w:rPr>
+      </w:pPr>
+      <w:r>
+        <w:rPr>
+          <w:rFonts w:hint="cs"/>
+          <w:rtl/>
+          <w:lang w:bidi="ar-EG"/>
+        </w:rPr>
+        <w:t xml:space="preserve">وده هيتم من خلال اننا هنيجيب من مكتبه ال </w:t>
+      </w:r>
+      <w:proofErr w:type="spellStart"/>
+      <w:r>
+        <w:rPr>
+          <w:lang w:bidi="ar-EG"/>
+        </w:rPr>
+        <w:t>fastapi</w:t>
+      </w:r>
+      <w:proofErr w:type="spellEnd"/>
+      <w:r>
+        <w:rPr>
+          <w:rFonts w:hint="cs"/>
+          <w:rtl/>
+          <w:lang w:bidi="ar-EG"/>
+        </w:rPr>
+        <w:t xml:space="preserve"> الي </w:t>
+      </w:r>
+      <w:r>
+        <w:rPr>
+          <w:lang w:bidi="ar-EG"/>
+        </w:rPr>
+        <w:t>Request</w:t>
+      </w:r>
+    </w:p>
+    <w:p>
+      <w:pPr>
+        <w:bidi/>
+        <w:rPr>
+          <w:lang w:bidi="ar-EG"/>
+        </w:rPr>
+      </w:pPr>
+      <w:r>
+        <w:rPr>
+          <w:rFonts w:cs="Arial"/>
+          <w:rtl/>
+          <w:lang w:bidi="ar-EG"/>
+        </w:rPr>
+        <w:drawing>
+          <wp:inline distT="0" distB="0" distL="0" distR="0" wp14:anchorId="3B9DD3BC" wp14:editId="30D094DC">
+            <wp:extent cx="5658640" cy="323895"/>
+            <wp:effectExtent l="0" t="0" r="0" b="0"/>
+            <wp:docPr id="49" name="Picture 49"/>
+            <wp:cNvGraphicFramePr>
+              <a:graphicFrameLocks xmlns:a="http://schemas.openxmlformats.org/drawingml/2006/main" noChangeAspect="1"/>
+            </wp:cNvGraphicFramePr>
+            <a:graphic xmlns:a="http://schemas.openxmlformats.org/drawingml/2006/main">
+              <a:graphicData uri="http://schemas.openxmlformats.org/drawingml/2006/picture">
+                <pic:pic xmlns:pic="http://schemas.openxmlformats.org/drawingml/2006/picture">
+                  <pic:nvPicPr>
+                    <pic:cNvPr id="1" name=""/>
+                    <pic:cNvPicPr/>
+                  </pic:nvPicPr>
+                  <pic:blipFill>
+                    <a:blip r:embed="rId52"/>
+                    <a:stretch>
+                      <a:fillRect/>
+                    </a:stretch>
+                  </pic:blipFill>
+                  <pic:spPr>
+                    <a:xfrm>
+                      <a:off x="0" y="0"/>
+                      <a:ext cx="5658640" cy="323895"/>
+                    </a:xfrm>
+                    <a:prstGeom prst="rect">
+                      <a:avLst/>
+                    </a:prstGeom>
+                  </pic:spPr>
+                </pic:pic>
+              </a:graphicData>
+            </a:graphic>
+          </wp:inline>
+        </w:drawing>
+      </w:r>
+    </w:p>
+    <w:p>
+      <w:pPr>
+        <w:bidi/>
+        <w:rPr>
+          <w:lang w:bidi="ar-EG"/>
+        </w:rPr>
+      </w:pPr>
+    </w:p>
+    <w:p>
+      <w:pPr>
+        <w:bidi/>
+        <w:rPr>
+          <w:lang w:bidi="ar-EG"/>
+        </w:rPr>
+      </w:pPr>
+      <w:r>
+        <w:rPr>
+          <w:rFonts w:hint="cs"/>
+          <w:rtl/>
+          <w:lang w:bidi="ar-EG"/>
+        </w:rPr>
+        <w:t xml:space="preserve">بعد كده هنروح ل </w:t>
+      </w:r>
+      <w:r>
+        <w:rPr>
+          <w:lang w:bidi="ar-EG"/>
+        </w:rPr>
+        <w:t>route</w:t>
+      </w:r>
+      <w:r>
+        <w:rPr>
+          <w:rFonts w:hint="cs"/>
+          <w:rtl/>
+          <w:lang w:bidi="ar-EG"/>
+        </w:rPr>
+        <w:t xml:space="preserve"> ده نضيف عليه ال </w:t>
+      </w:r>
+      <w:r>
+        <w:rPr>
+          <w:lang w:bidi="ar-EG"/>
+        </w:rPr>
+        <w:t>request</w:t>
+      </w:r>
+    </w:p>
+    <w:p>
+      <w:pPr>
+        <w:bidi/>
+        <w:rPr>
+          <w:lang w:bidi="ar-EG"/>
+        </w:rPr>
+      </w:pPr>
+      <w:r>
+        <w:rPr>
+          <w:rFonts w:cs="Arial"/>
+          <w:rtl/>
+          <w:lang w:bidi="ar-EG"/>
+        </w:rPr>
+        <w:drawing>
+          <wp:inline distT="0" distB="0" distL="0" distR="0" wp14:anchorId="59CF6017" wp14:editId="4D44CD0E">
+            <wp:extent cx="5943600" cy="742950"/>
+            <wp:effectExtent l="0" t="0" r="0" b="0"/>
+            <wp:docPr id="50" name="Picture 50"/>
+            <wp:cNvGraphicFramePr>
+              <a:graphicFrameLocks xmlns:a="http://schemas.openxmlformats.org/drawingml/2006/main" noChangeAspect="1"/>
+            </wp:cNvGraphicFramePr>
+            <a:graphic xmlns:a="http://schemas.openxmlformats.org/drawingml/2006/main">
+              <a:graphicData uri="http://schemas.openxmlformats.org/drawingml/2006/picture">
+                <pic:pic xmlns:pic="http://schemas.openxmlformats.org/drawingml/2006/picture">
+                  <pic:nvPicPr>
+                    <pic:cNvPr id="1" name=""/>
+                    <pic:cNvPicPr/>
+                  </pic:nvPicPr>
+                  <pic:blipFill>
+                    <a:blip r:embed="rId53"/>
+                    <a:stretch>
+                      <a:fillRect/>
+                    </a:stretch>
+                  </pic:blipFill>
+                  <pic:spPr>
+                    <a:xfrm>
+                      <a:off x="0" y="0"/>
+                      <a:ext cx="5943600" cy="742950"/>
+                    </a:xfrm>
+                    <a:prstGeom prst="rect">
+                      <a:avLst/>
+                    </a:prstGeom>
+                  </pic:spPr>
+                </pic:pic>
+              </a:graphicData>
+            </a:graphic>
+          </wp:inline>
+        </w:drawing>
+      </w:r>
+    </w:p>
+    <w:p>
+      <w:pPr>
+        <w:bidi/>
+        <w:rPr>
+          <w:lang w:bidi="ar-EG"/>
+        </w:rPr>
+      </w:pPr>
+    </w:p>
+    <w:p>
+      <w:pPr>
+        <w:bidi/>
+        <w:rPr>
+          <w:rtl/>
+          <w:lang w:bidi="ar-EG"/>
+        </w:rPr>
+      </w:pPr>
+      <w:r>
+        <w:rPr>
+          <w:rFonts w:hint="cs"/>
+          <w:rtl/>
+          <w:lang w:bidi="ar-EG"/>
+        </w:rPr>
+        <w:t>وبقي ده شكله</w:t>
+      </w:r>
+    </w:p>
+    <w:p>
+      <w:pPr>
+        <w:bidi/>
+        <w:rPr>
+          <w:lang w:bidi="ar-EG"/>
+        </w:rPr>
+      </w:pPr>
+      <w:r>
+        <w:rPr>
+          <w:rFonts w:cs="Arial"/>
+          <w:rtl/>
+          <w:lang w:bidi="ar-EG"/>
+        </w:rPr>
+        <w:drawing>
+          <wp:inline distT="0" distB="0" distL="0" distR="0" wp14:anchorId="1BD631EA" wp14:editId="052BA25C">
+            <wp:extent cx="5943600" cy="638175"/>
+            <wp:effectExtent l="0" t="0" r="0" b="9525"/>
+            <wp:docPr id="51" name="Picture 51"/>
+            <wp:cNvGraphicFramePr>
+              <a:graphicFrameLocks xmlns:a="http://schemas.openxmlformats.org/drawingml/2006/main" noChangeAspect="1"/>
+            </wp:cNvGraphicFramePr>
+            <a:graphic xmlns:a="http://schemas.openxmlformats.org/drawingml/2006/main">
+              <a:graphicData uri="http://schemas.openxmlformats.org/drawingml/2006/picture">
+                <pic:pic xmlns:pic="http://schemas.openxmlformats.org/drawingml/2006/picture">
+                  <pic:nvPicPr>
+                    <pic:cNvPr id="1" name=""/>
+                    <pic:cNvPicPr/>
+                  </pic:nvPicPr>
+                  <pic:blipFill>
+                    <a:blip r:embed="rId54"/>
+                    <a:stretch>
+                      <a:fillRect/>
+                    </a:stretch>
+                  </pic:blipFill>
+                  <pic:spPr>
+                    <a:xfrm>
+                      <a:off x="0" y="0"/>
+                      <a:ext cx="5943600" cy="638175"/>
+                    </a:xfrm>
+                    <a:prstGeom prst="rect">
+                      <a:avLst/>
+                    </a:prstGeom>
+                  </pic:spPr>
+                </pic:pic>
+              </a:graphicData>
+            </a:graphic>
+          </wp:inline>
+        </w:drawing>
+      </w:r>
+    </w:p>
+    <w:p>
+      <w:pPr>
+        <w:bidi/>
+        <w:rPr>
+          <w:lang w:bidi="ar-EG"/>
+        </w:rPr>
+      </w:pPr>
+    </w:p>
+    <w:p>
+      <w:pPr>
+        <w:bidi/>
+        <w:rPr>
+          <w:rtl/>
+          <w:lang w:bidi="ar-EG"/>
+        </w:rPr>
+      </w:pPr>
+      <w:r>
+        <w:rPr>
+          <w:rFonts w:hint="cs"/>
+          <w:rtl/>
+          <w:lang w:bidi="ar-EG"/>
+        </w:rPr>
+        <w:t>ولما استتعملنها كده اشتغلت تمام</w:t>
+      </w:r>
+    </w:p>
+    <w:p>
+      <w:pPr>
+        <w:bidi/>
+        <w:rPr>
+          <w:rFonts w:hint="cs"/>
+          <w:lang w:bidi="ar-EG"/>
+        </w:rPr>
+      </w:pPr>
+      <w:r>
+        <w:rPr>
+          <w:rFonts w:hint="cs"/>
+          <w:rtl/>
+          <w:lang w:bidi="ar-EG"/>
+        </w:rPr>
+        <w:t xml:space="preserve">بس كان في مشكله انه لو ال </w:t>
+      </w:r>
+      <w:r>
+        <w:rPr>
+          <w:lang w:bidi="ar-EG"/>
+        </w:rPr>
+        <w:t>project</w:t>
+      </w:r>
+      <w:r>
+        <w:rPr>
+          <w:rFonts w:hint="cs"/>
+          <w:rtl/>
+          <w:lang w:bidi="ar-EG"/>
+        </w:rPr>
+        <w:t xml:space="preserve"> موجود بيرجع </w:t>
+      </w:r>
+      <w:r>
+        <w:rPr>
+          <w:lang w:bidi="ar-EG"/>
+        </w:rPr>
+        <w:t>none</w:t>
+      </w:r>
+      <w:r>
+        <w:rPr>
+          <w:rFonts w:hint="cs"/>
+          <w:rtl/>
+          <w:lang w:bidi="ar-EG"/>
+        </w:rPr>
+        <w:t xml:space="preserve"> وده غالبا هيكون هتتحل لما نعمل </w:t>
+      </w:r>
+      <w:r>
+        <w:rPr>
+          <w:lang w:bidi="ar-EG"/>
+        </w:rPr>
+        <w:t>_id</w:t>
+      </w:r>
+      <w:r>
+        <w:rPr>
+          <w:rFonts w:hint="cs"/>
+          <w:rtl/>
+          <w:lang w:bidi="ar-EG"/>
+        </w:rPr>
+        <w:t xml:space="preserve"> انه يكون ب </w:t>
+      </w:r>
+      <w:r>
+        <w:rPr>
+          <w:lang w:bidi="ar-EG"/>
+        </w:rPr>
+        <w:t>alias</w:t>
+      </w:r>
+    </w:p>
+    <w:p>
+      <w:pPr>
+        <w:bidi/>
+        <w:rPr>
+          <w:lang w:bidi="ar-EG"/>
+        </w:rPr>
+      </w:pPr>
+      <w:r>
+        <w:rPr>
+          <w:rFonts w:cs="Arial"/>
+          <w:rtl/>
+          <w:lang w:bidi="ar-EG"/>
+        </w:rPr>
+        <w:drawing>
+          <wp:inline distT="0" distB="0" distL="0" distR="0" wp14:anchorId="5196D7E0" wp14:editId="52CF54D4">
+            <wp:extent cx="5012724" cy="1477575"/>
+            <wp:effectExtent l="0" t="0" r="0" b="8890"/>
+            <wp:docPr id="52" name="Picture 52"/>
+            <wp:cNvGraphicFramePr>
+              <a:graphicFrameLocks xmlns:a="http://schemas.openxmlformats.org/drawingml/2006/main" noChangeAspect="1"/>
+            </wp:cNvGraphicFramePr>
+            <a:graphic xmlns:a="http://schemas.openxmlformats.org/drawingml/2006/main">
+              <a:graphicData uri="http://schemas.openxmlformats.org/drawingml/2006/picture">
+                <pic:pic xmlns:pic="http://schemas.openxmlformats.org/drawingml/2006/picture">
+                  <pic:nvPicPr>
+                    <pic:cNvPr id="1" name=""/>
+                    <pic:cNvPicPr/>
+                  </pic:nvPicPr>
+                  <pic:blipFill>
+                    <a:blip r:embed="rId55"/>
+                    <a:stretch>
+                      <a:fillRect/>
+                    </a:stretch>
+                  </pic:blipFill>
+                  <pic:spPr>
+                    <a:xfrm>
+                      <a:off x="0" y="0"/>
+                      <a:ext cx="5017937" cy="1479112"/>
+                    </a:xfrm>
+                    <a:prstGeom prst="rect">
+                      <a:avLst/>
+                    </a:prstGeom>
+                  </pic:spPr>
+                </pic:pic>
+              </a:graphicData>
+            </a:graphic>
+          </wp:inline>
+        </w:drawing>
+      </w:r>
+    </w:p>
+    <w:p>
+      <w:pPr>
+        <w:bidi/>
+        <w:rPr>
+          <w:lang w:bidi="ar-EG"/>
+        </w:rPr>
+      </w:pPr>
+    </w:p>
+    <w:p>
+      <w:pPr>
+        <w:bidi/>
+        <w:rPr>
+          <w:lang w:bidi="ar-EG"/>
+        </w:rPr>
+      </w:pPr>
+    </w:p>
+    <w:p>
+      <w:pPr>
+        <w:bidi/>
+        <w:rPr>
+          <w:lang w:bidi="ar-EG"/>
+        </w:rPr>
+      </w:pPr>
+    </w:p>
+    <w:p>
+      <w:pPr>
+        <w:bidi/>
+        <w:rPr>
+          <w:lang w:bidi="ar-EG"/>
+        </w:rPr>
+      </w:pPr>
+    </w:p>
+    <w:p>
+      <w:pPr>
+        <w:bidi/>
+        <w:rPr>
+          <w:lang w:bidi="ar-EG"/>
+        </w:rPr>
+      </w:pPr>
+    </w:p>
+    <w:p>
+      <w:pPr>
+        <w:bidi/>
+        <w:rPr>
+          <w:rtl/>
+          <w:lang w:bidi="ar-EG"/>
+        </w:rPr>
+      </w:pPr>
+      <w:r>
+        <w:rPr>
+          <w:rFonts w:hint="cs"/>
+          <w:rtl/>
+          <w:lang w:bidi="ar-EG"/>
+        </w:rPr>
+        <w:lastRenderedPageBreak/>
+        <w:t xml:space="preserve">دلوقتي بقي عاوزين نعمل نفس الي عملناه مع ال </w:t>
+      </w:r>
+      <w:r>
+        <w:rPr>
+          <w:lang w:bidi="ar-EG"/>
+        </w:rPr>
+        <w:t>project</w:t>
+      </w:r>
+    </w:p>
+    <w:p>
+      <w:pPr>
+        <w:bidi/>
+        <w:rPr>
+          <w:rtl/>
+          <w:lang w:bidi="ar-EG"/>
+        </w:rPr>
+      </w:pPr>
+      <w:r>
+        <w:rPr>
+          <w:rFonts w:hint="cs"/>
+          <w:rtl/>
+          <w:lang w:bidi="ar-EG"/>
+        </w:rPr>
+        <w:t xml:space="preserve">اننا نعمله مع ال </w:t>
+      </w:r>
+      <w:r>
+        <w:rPr>
+          <w:lang w:bidi="ar-EG"/>
+        </w:rPr>
+        <w:t>route</w:t>
+      </w:r>
+      <w:r>
+        <w:rPr>
+          <w:rFonts w:hint="cs"/>
+          <w:rtl/>
+          <w:lang w:bidi="ar-EG"/>
+        </w:rPr>
+        <w:t xml:space="preserve"> بتاع ال </w:t>
+      </w:r>
+      <w:r>
+        <w:rPr>
+          <w:lang w:bidi="ar-EG"/>
+        </w:rPr>
+        <w:t>chunks</w:t>
+      </w:r>
+    </w:p>
+    <w:p>
+      <w:pPr>
+        <w:bidi/>
+        <w:rPr>
+          <w:lang w:bidi="ar-EG"/>
+        </w:rPr>
+      </w:pPr>
+      <w:r>
+        <w:rPr>
+          <w:rFonts w:hint="cs"/>
+          <w:rtl/>
+          <w:lang w:bidi="ar-EG"/>
+        </w:rPr>
+        <w:t xml:space="preserve">والي هو ال </w:t>
+      </w:r>
+      <w:r>
+        <w:rPr>
+          <w:lang w:bidi="ar-EG"/>
+        </w:rPr>
+        <w:t>process</w:t>
+      </w:r>
+    </w:p>
+    <w:p>
+      <w:pPr>
+        <w:bidi/>
+        <w:rPr>
+          <w:lang w:bidi="ar-EG"/>
+        </w:rPr>
+      </w:pPr>
+    </w:p>
+    <w:p>
+      <w:pPr>
+        <w:bidi/>
+        <w:rPr>
+          <w:rtl/>
+          <w:lang w:bidi="ar-EG"/>
+        </w:rPr>
+      </w:pPr>
+      <w:r>
+        <w:rPr>
+          <w:rFonts w:hint="cs"/>
+          <w:rtl/>
+          <w:lang w:bidi="ar-EG"/>
+        </w:rPr>
+        <w:t xml:space="preserve">فهنروح ل </w:t>
+      </w:r>
+      <w:proofErr w:type="spellStart"/>
+      <w:r>
+        <w:rPr>
+          <w:lang w:bidi="ar-EG"/>
+        </w:rPr>
+        <w:t>ChunkModel</w:t>
+      </w:r>
+      <w:proofErr w:type="spellEnd"/>
+    </w:p>
+    <w:p>
+      <w:pPr>
+        <w:bidi/>
+        <w:rPr>
+          <w:rtl/>
+          <w:lang w:bidi="ar-EG"/>
+        </w:rPr>
+      </w:pPr>
+      <w:r>
+        <w:rPr>
+          <w:rFonts w:hint="cs"/>
+          <w:rtl/>
+          <w:lang w:bidi="ar-EG"/>
+        </w:rPr>
+        <w:t>وهنبدا اننا نشتغل عليه</w:t>
+      </w:r>
+    </w:p>
+    <w:p>
+      <w:pPr>
+        <w:bidi/>
+        <w:rPr>
+          <w:rtl/>
+          <w:lang w:bidi="ar-EG"/>
+        </w:rPr>
+      </w:pPr>
+    </w:p>
+    <w:p>
+      <w:pPr>
+        <w:bidi/>
+        <w:rPr>
+          <w:lang w:bidi="ar-EG"/>
+        </w:rPr>
+      </w:pPr>
+      <w:r>
+        <w:rPr>
+          <w:rFonts w:hint="cs"/>
+          <w:rtl/>
+          <w:lang w:bidi="ar-EG"/>
+        </w:rPr>
+        <w:t xml:space="preserve">فاول حاجه جبناها هو اسم </w:t>
+      </w:r>
+      <w:r>
+        <w:rPr>
+          <w:lang w:bidi="ar-EG"/>
+        </w:rPr>
+        <w:t>collection</w:t>
+      </w:r>
+      <w:r>
+        <w:rPr>
+          <w:rFonts w:hint="cs"/>
+          <w:rtl/>
+          <w:lang w:bidi="ar-EG"/>
+        </w:rPr>
+        <w:t xml:space="preserve"> الي هنحطه في ال </w:t>
+      </w:r>
+      <w:r>
+        <w:rPr>
+          <w:lang w:bidi="ar-EG"/>
+        </w:rPr>
+        <w:t>mongo</w:t>
+      </w:r>
+    </w:p>
+    <w:p>
+      <w:pPr>
+        <w:bidi/>
+        <w:rPr>
+          <w:lang w:bidi="ar-EG"/>
+        </w:rPr>
+      </w:pPr>
+    </w:p>
+    <w:p>
+      <w:pPr>
+        <w:bidi/>
+        <w:rPr>
+          <w:lang w:bidi="ar-EG"/>
+        </w:rPr>
+      </w:pPr>
+      <w:r>
+        <w:rPr>
+          <w:rFonts w:hint="cs"/>
+          <w:rtl/>
+          <w:lang w:bidi="ar-EG"/>
+        </w:rPr>
+        <w:t xml:space="preserve">وبعد كده عملنا </w:t>
+      </w:r>
+      <w:r>
+        <w:rPr>
+          <w:lang w:bidi="ar-EG"/>
+        </w:rPr>
+        <w:t>function</w:t>
+      </w:r>
+      <w:r>
+        <w:rPr>
+          <w:rFonts w:hint="cs"/>
+          <w:rtl/>
+          <w:lang w:bidi="ar-EG"/>
+        </w:rPr>
+        <w:t xml:space="preserve"> اسمها </w:t>
+      </w:r>
+      <w:proofErr w:type="spellStart"/>
+      <w:r>
+        <w:rPr>
+          <w:lang w:bidi="ar-EG"/>
+        </w:rPr>
+        <w:t>create_chunk</w:t>
+      </w:r>
+      <w:proofErr w:type="spellEnd"/>
+    </w:p>
+    <w:p>
+      <w:pPr>
+        <w:bidi/>
+        <w:rPr>
+          <w:lang w:bidi="ar-EG"/>
+        </w:rPr>
+      </w:pPr>
+      <w:r>
+        <w:rPr>
+          <w:rFonts w:hint="cs"/>
+          <w:rtl/>
+          <w:lang w:bidi="ar-EG"/>
+        </w:rPr>
+        <w:t xml:space="preserve">والي هتبدا انها تضيفها في ال </w:t>
+      </w:r>
+      <w:r>
+        <w:rPr>
+          <w:lang w:bidi="ar-EG"/>
+        </w:rPr>
+        <w:t>mongo</w:t>
+      </w:r>
+    </w:p>
+    <w:p>
+      <w:pPr>
+        <w:bidi/>
+        <w:rPr>
+          <w:lang w:bidi="ar-EG"/>
+        </w:rPr>
+      </w:pPr>
+    </w:p>
+    <w:p>
+      <w:pPr>
+        <w:bidi/>
+        <w:rPr>
+          <w:lang w:bidi="ar-EG"/>
+        </w:rPr>
+      </w:pPr>
+      <w:r>
+        <w:rPr>
+          <w:rFonts w:hint="cs"/>
+          <w:rtl/>
+          <w:lang w:bidi="ar-EG"/>
+        </w:rPr>
+        <w:t xml:space="preserve">وبعد كده عملنا </w:t>
+      </w:r>
+      <w:r>
+        <w:rPr>
+          <w:lang w:bidi="ar-EG"/>
+        </w:rPr>
+        <w:t>function</w:t>
+      </w:r>
+      <w:r>
+        <w:rPr>
+          <w:rFonts w:hint="cs"/>
+          <w:rtl/>
+          <w:lang w:bidi="ar-EG"/>
+        </w:rPr>
+        <w:t xml:space="preserve"> تانيه خاصه ب </w:t>
+      </w:r>
+      <w:proofErr w:type="spellStart"/>
+      <w:r>
+        <w:rPr>
+          <w:lang w:bidi="ar-EG"/>
+        </w:rPr>
+        <w:t>get_chunk</w:t>
+      </w:r>
+      <w:proofErr w:type="spellEnd"/>
+    </w:p>
+    <w:p>
+      <w:pPr>
+        <w:bidi/>
+        <w:rPr>
+          <w:lang w:bidi="ar-EG"/>
+        </w:rPr>
+      </w:pPr>
+      <w:r>
+        <w:rPr>
+          <w:rFonts w:hint="cs"/>
+          <w:rtl/>
+          <w:lang w:bidi="ar-EG"/>
+        </w:rPr>
+        <w:t xml:space="preserve">فهو هيبدا انه لو لقا ال </w:t>
+      </w:r>
+      <w:r>
+        <w:rPr>
+          <w:lang w:bidi="ar-EG"/>
+        </w:rPr>
+        <w:t>chunk</w:t>
+      </w:r>
+      <w:r>
+        <w:rPr>
+          <w:rFonts w:hint="cs"/>
+          <w:rtl/>
+          <w:lang w:bidi="ar-EG"/>
+        </w:rPr>
+        <w:t xml:space="preserve"> يرجعها ولو ملقهاش هيرجع </w:t>
+      </w:r>
+      <w:r>
+        <w:rPr>
+          <w:lang w:bidi="ar-EG"/>
+        </w:rPr>
+        <w:t>none</w:t>
+      </w:r>
+    </w:p>
+    <w:p>
+      <w:pPr>
+        <w:bidi/>
+        <w:rPr>
+          <w:rFonts w:hint="cs"/>
+          <w:rtl/>
+          <w:lang w:bidi="ar-EG"/>
+        </w:rPr>
+      </w:pPr>
+      <w:r>
+        <w:rPr>
+          <w:rFonts w:hint="cs"/>
+          <w:rtl/>
+          <w:lang w:bidi="ar-EG"/>
+        </w:rPr>
+        <w:t>وده الي عملناه لحد دلوقتي</w:t>
+      </w:r>
+    </w:p>
+    <w:p>
+      <w:pPr>
+        <w:bidi/>
+        <w:rPr>
+          <w:rFonts w:hint="cs"/>
+          <w:lang w:bidi="ar-EG"/>
+        </w:rPr>
+      </w:pPr>
+      <w:r>
+        <w:rPr>
+          <w:noProof/>
+        </w:rPr>
+        <w:drawing>
+          <wp:inline distT="0" distB="0" distL="0" distR="0" wp14:anchorId="1FF3E771" wp14:editId="75265DC1">
+            <wp:extent cx="5280454" cy="3871251"/>
+            <wp:effectExtent l="0" t="0" r="0" b="0"/>
+            <wp:docPr id="53" name="Picture 53"/>
+            <wp:cNvGraphicFramePr>
+              <a:graphicFrameLocks xmlns:a="http://schemas.openxmlformats.org/drawingml/2006/main" noChangeAspect="1"/>
+            </wp:cNvGraphicFramePr>
+            <a:graphic xmlns:a="http://schemas.openxmlformats.org/drawingml/2006/main">
+              <a:graphicData uri="http://schemas.openxmlformats.org/drawingml/2006/picture">
+                <pic:pic xmlns:pic="http://schemas.openxmlformats.org/drawingml/2006/picture">
+                  <pic:nvPicPr>
+                    <pic:cNvPr id="0" name="Picture 3"/>
+                    <pic:cNvPicPr>
+                      <a:picLocks noChangeAspect="1" noChangeArrowheads="1"/>
+                    </pic:cNvPicPr>
+                  </pic:nvPicPr>
+                  <pic:blipFill rotWithShape="1">
+                    <a:blip r:embed="rId56" cstate="print">
+                      <a:extLst>
+                        <a:ext uri="{28A0092B-C50C-407E-A947-70E740481C1C}">
+                          <a14:useLocalDpi xmlns:a14="http://schemas.microsoft.com/office/drawing/2010/main" val="0"/>
+                        </a:ext>
+                      </a:extLst>
+                    </a:blip>
+                    <a:srcRect l="5960" t="12939" r="5186" b="7044"/>
+                    <a:stretch/>
+                  </pic:blipFill>
+                  <pic:spPr bwMode="auto">
+                    <a:xfrm>
+                      <a:off x="0" y="0"/>
+                      <a:ext cx="5281151" cy="3871762"/>
+                    </a:xfrm>
+                    <a:prstGeom prst="rect">
+                      <a:avLst/>
+                    </a:prstGeom>
+                    <a:noFill/>
+                    <a:ln>
+                      <a:noFill/>
+                    </a:ln>
+                    <a:extLst>
+                      <a:ext uri="{53640926-AAD7-44D8-BBD7-CCE9431645EC}">
+                        <a14:shadowObscured xmlns:a14="http://schemas.microsoft.com/office/drawing/2010/main"/>
+                      </a:ext>
+                    </a:extLst>
+                  </pic:spPr>
+                </pic:pic>
+              </a:graphicData>
+            </a:graphic>
+          </wp:inline>
+        </w:drawing>
+      </w:r>
+    </w:p>
+    <w:p>
+      <w:pPr>
+        <w:bidi/>
+        <w:rPr>
+          <w:rtl/>
+          <w:lang w:bidi="ar-EG"/>
+        </w:rPr>
+      </w:pPr>
+      <w:r>
+        <w:rPr>
+          <w:rFonts w:hint="cs"/>
+          <w:rtl/>
+          <w:lang w:bidi="ar-EG"/>
+        </w:rPr>
+        <w:lastRenderedPageBreak/>
+        <w:t xml:space="preserve">دلوقتي بقي هنبدا اننا نشتغل علي ال </w:t>
+      </w:r>
+      <w:r>
+        <w:rPr>
+          <w:lang w:bidi="ar-EG"/>
+        </w:rPr>
+        <w:t>function</w:t>
+      </w:r>
+      <w:r>
+        <w:rPr>
+          <w:rFonts w:hint="cs"/>
+          <w:rtl/>
+          <w:lang w:bidi="ar-EG"/>
+        </w:rPr>
+        <w:t xml:space="preserve"> الي من خلال هنبدا اننا نعمل </w:t>
+      </w:r>
+      <w:r>
+        <w:rPr>
+          <w:lang w:bidi="ar-EG"/>
+        </w:rPr>
+        <w:t>insert</w:t>
+      </w:r>
+      <w:r>
+        <w:rPr>
+          <w:rFonts w:hint="cs"/>
+          <w:rtl/>
+          <w:lang w:bidi="ar-EG"/>
+        </w:rPr>
+        <w:t xml:space="preserve"> لاكتر من </w:t>
+      </w:r>
+      <w:r>
+        <w:rPr>
+          <w:lang w:bidi="ar-EG"/>
+        </w:rPr>
+        <w:t>chunk</w:t>
+      </w:r>
+    </w:p>
+    <w:p>
+      <w:pPr>
+        <w:bidi/>
+        <w:rPr>
+          <w:rtl/>
+          <w:lang w:bidi="ar-EG"/>
+        </w:rPr>
+      </w:pPr>
+      <w:r>
+        <w:rPr>
+          <w:rFonts w:hint="cs"/>
+          <w:rtl/>
+          <w:lang w:bidi="ar-EG"/>
+        </w:rPr>
+        <w:t xml:space="preserve">فلو انت معاك وليكن </w:t>
+      </w:r>
+      <w:r>
+        <w:rPr>
+          <w:lang w:bidi="ar-EG"/>
+        </w:rPr>
+        <w:t>100000 chunk</w:t>
+      </w:r>
+      <w:r>
+        <w:rPr>
+          <w:rFonts w:hint="cs"/>
+          <w:rtl/>
+          <w:lang w:bidi="ar-EG"/>
+        </w:rPr>
+        <w:t xml:space="preserve"> فمش منطقي انك تروح تضيفهم كلهم مره واحده</w:t>
+      </w:r>
+    </w:p>
+    <w:p>
+      <w:pPr>
+        <w:bidi/>
+        <w:rPr>
+          <w:rtl/>
+          <w:lang w:bidi="ar-EG"/>
+        </w:rPr>
+      </w:pPr>
+    </w:p>
+    <w:p>
+      <w:pPr>
+        <w:bidi/>
+        <w:rPr>
+          <w:lang w:bidi="ar-EG"/>
+        </w:rPr>
+      </w:pPr>
+      <w:r>
+        <w:rPr>
+          <w:rFonts w:hint="cs"/>
+          <w:rtl/>
+          <w:lang w:bidi="ar-EG"/>
+        </w:rPr>
+        <w:t xml:space="preserve">فالافضل والصح انك تبدا انك تضيف ال </w:t>
+      </w:r>
+      <w:r>
+        <w:rPr>
+          <w:lang w:bidi="ar-EG"/>
+        </w:rPr>
+        <w:t>chunks</w:t>
+      </w:r>
+      <w:r>
+        <w:rPr>
+          <w:rFonts w:hint="cs"/>
+          <w:rtl/>
+          <w:lang w:bidi="ar-EG"/>
+        </w:rPr>
+        <w:t xml:space="preserve"> دي ك </w:t>
+      </w:r>
+      <w:r>
+        <w:rPr>
+          <w:lang w:bidi="ar-EG"/>
+        </w:rPr>
+        <w:t>batches</w:t>
+      </w:r>
+    </w:p>
+    <w:p>
+      <w:pPr>
+        <w:bidi/>
+        <w:rPr>
+          <w:rtl/>
+          <w:lang w:bidi="ar-EG"/>
+        </w:rPr>
+      </w:pPr>
+      <w:r>
+        <w:rPr>
+          <w:rFonts w:hint="cs"/>
+          <w:rtl/>
+          <w:lang w:bidi="ar-EG"/>
+        </w:rPr>
+        <w:t xml:space="preserve">فانت من ال </w:t>
+      </w:r>
+      <w:proofErr w:type="spellStart"/>
+      <w:r>
+        <w:rPr>
+          <w:lang w:bidi="ar-EG"/>
+        </w:rPr>
+        <w:t>pymongo</w:t>
+      </w:r>
+      <w:proofErr w:type="spellEnd"/>
+      <w:r>
+        <w:rPr>
+          <w:rFonts w:hint="cs"/>
+          <w:rtl/>
+          <w:lang w:bidi="ar-EG"/>
+        </w:rPr>
+        <w:t xml:space="preserve"> بتستعمل ال </w:t>
+      </w:r>
+      <w:proofErr w:type="spellStart"/>
+      <w:r>
+        <w:rPr>
+          <w:lang w:bidi="ar-EG"/>
+        </w:rPr>
+        <w:t>InsertOne</w:t>
+      </w:r>
+      <w:proofErr w:type="spellEnd"/>
+      <w:r>
+        <w:rPr>
+          <w:rFonts w:hint="cs"/>
+          <w:rtl/>
+          <w:lang w:bidi="ar-EG"/>
+        </w:rPr>
+        <w:t xml:space="preserve"> والي دي عبارة عن وصف للعمليه </w:t>
+      </w:r>
+    </w:p>
+    <w:p>
+      <w:pPr>
+        <w:bidi/>
+        <w:rPr>
+          <w:rtl/>
+          <w:lang w:bidi="ar-EG"/>
+        </w:rPr>
+      </w:pPr>
+      <w:r>
+        <w:rPr>
+          <w:rFonts w:cs="Arial"/>
+          <w:rtl/>
+          <w:lang w:bidi="ar-EG"/>
+        </w:rPr>
+        <w:drawing>
+          <wp:inline distT="0" distB="0" distL="0" distR="0" wp14:anchorId="483FCC82" wp14:editId="2F65DBAA">
+            <wp:extent cx="3720962" cy="1629511"/>
+            <wp:effectExtent l="0" t="0" r="0" b="8890"/>
+            <wp:docPr id="54" name="Picture 54"/>
+            <wp:cNvGraphicFramePr>
+              <a:graphicFrameLocks xmlns:a="http://schemas.openxmlformats.org/drawingml/2006/main" noChangeAspect="1"/>
+            </wp:cNvGraphicFramePr>
+            <a:graphic xmlns:a="http://schemas.openxmlformats.org/drawingml/2006/main">
+              <a:graphicData uri="http://schemas.openxmlformats.org/drawingml/2006/picture">
+                <pic:pic xmlns:pic="http://schemas.openxmlformats.org/drawingml/2006/picture">
+                  <pic:nvPicPr>
+                    <pic:cNvPr id="1" name=""/>
+                    <pic:cNvPicPr/>
+                  </pic:nvPicPr>
+                  <pic:blipFill>
+                    <a:blip r:embed="rId57"/>
+                    <a:stretch>
+                      <a:fillRect/>
+                    </a:stretch>
+                  </pic:blipFill>
+                  <pic:spPr>
+                    <a:xfrm>
+                      <a:off x="0" y="0"/>
+                      <a:ext cx="3730370" cy="1633631"/>
+                    </a:xfrm>
+                    <a:prstGeom prst="rect">
+                      <a:avLst/>
+                    </a:prstGeom>
+                  </pic:spPr>
+                </pic:pic>
+              </a:graphicData>
+            </a:graphic>
+          </wp:inline>
+        </w:drawing>
+      </w:r>
+    </w:p>
+    <w:p>
+      <w:pPr>
+        <w:bidi/>
+        <w:rPr>
+          <w:rtl/>
+          <w:lang w:bidi="ar-EG"/>
+        </w:rPr>
+      </w:pPr>
+    </w:p>
+    <w:p>
+      <w:pPr>
+        <w:bidi/>
+        <w:rPr>
+          <w:lang w:bidi="ar-EG"/>
+        </w:rPr>
+      </w:pPr>
+      <w:r>
+        <w:rPr>
+          <w:rFonts w:hint="cs"/>
+          <w:rtl/>
+          <w:lang w:bidi="ar-EG"/>
+        </w:rPr>
+        <w:t xml:space="preserve">هنرجع بقي علي ال </w:t>
+      </w:r>
+      <w:r>
+        <w:rPr>
+          <w:lang w:bidi="ar-EG"/>
+        </w:rPr>
+        <w:t>route</w:t>
+      </w:r>
+      <w:r>
+        <w:rPr>
+          <w:rFonts w:hint="cs"/>
+          <w:rtl/>
+          <w:lang w:bidi="ar-EG"/>
+        </w:rPr>
+        <w:t xml:space="preserve"> بتاع ال </w:t>
+      </w:r>
+      <w:r>
+        <w:rPr>
+          <w:lang w:bidi="ar-EG"/>
+        </w:rPr>
+        <w:t>data</w:t>
+      </w:r>
+      <w:r>
+        <w:rPr>
+          <w:rFonts w:hint="cs"/>
+          <w:rtl/>
+          <w:lang w:bidi="ar-EG"/>
+        </w:rPr>
+        <w:t xml:space="preserve"> وهنبدا اننا نعمل بردو نفس الي عملناه في ال </w:t>
+      </w:r>
+      <w:r>
+        <w:rPr>
+          <w:lang w:bidi="ar-EG"/>
+        </w:rPr>
+        <w:t>upload</w:t>
+      </w:r>
+    </w:p>
+    <w:p>
+      <w:pPr>
+        <w:bidi/>
+        <w:rPr>
+          <w:lang w:bidi="ar-EG"/>
+        </w:rPr>
+      </w:pPr>
+      <w:r>
+        <w:rPr>
+          <w:rFonts w:hint="cs"/>
+          <w:rtl/>
+          <w:lang w:bidi="ar-EG"/>
+        </w:rPr>
+        <w:t xml:space="preserve">فاول حاجه هضيف ال </w:t>
+      </w:r>
+      <w:r>
+        <w:rPr>
+          <w:lang w:bidi="ar-EG"/>
+        </w:rPr>
+        <w:t>Request</w:t>
+      </w:r>
+    </w:p>
+    <w:p>
+      <w:pPr>
+        <w:bidi/>
+        <w:rPr>
+          <w:rtl/>
+          <w:lang w:bidi="ar-EG"/>
+        </w:rPr>
+      </w:pPr>
+      <w:r>
+        <w:rPr>
+          <w:rFonts w:hint="cs"/>
+          <w:rtl/>
+          <w:lang w:bidi="ar-EG"/>
+        </w:rPr>
+        <w:t xml:space="preserve">وبعد كده هبدا اني اضيف ال </w:t>
+      </w:r>
+      <w:r>
+        <w:rPr>
+          <w:lang w:bidi="ar-EG"/>
+        </w:rPr>
+        <w:t>project</w:t>
+      </w:r>
+      <w:r>
+        <w:rPr>
+          <w:rFonts w:hint="cs"/>
+          <w:rtl/>
+          <w:lang w:bidi="ar-EG"/>
+        </w:rPr>
+        <w:t xml:space="preserve"> في ال </w:t>
+      </w:r>
+      <w:r>
+        <w:rPr>
+          <w:lang w:bidi="ar-EG"/>
+        </w:rPr>
+        <w:t>mongo</w:t>
+      </w:r>
+      <w:r>
+        <w:rPr>
+          <w:rFonts w:hint="cs"/>
+          <w:rtl/>
+          <w:lang w:bidi="ar-EG"/>
+        </w:rPr>
+        <w:t xml:space="preserve"> زي ما عملنا قبل كده</w:t>
+      </w:r>
+    </w:p>
+    <w:p>
+      <w:pPr>
+        <w:bidi/>
+        <w:rPr>
+          <w:rtl/>
+          <w:lang w:bidi="ar-EG"/>
+        </w:rPr>
+      </w:pPr>
+      <w:r>
+        <w:rPr>
+          <w:rFonts w:cs="Arial"/>
+          <w:rtl/>
+          <w:lang w:bidi="ar-EG"/>
+        </w:rPr>
+        <w:drawing>
+          <wp:inline distT="0" distB="0" distL="0" distR="0" wp14:anchorId="5EFD8AD2" wp14:editId="045D03AD">
+            <wp:extent cx="4343672" cy="3915803"/>
+            <wp:effectExtent l="0" t="0" r="0" b="8890"/>
+            <wp:docPr id="55" name="Picture 55"/>
+            <wp:cNvGraphicFramePr>
+              <a:graphicFrameLocks xmlns:a="http://schemas.openxmlformats.org/drawingml/2006/main" noChangeAspect="1"/>
+            </wp:cNvGraphicFramePr>
+            <a:graphic xmlns:a="http://schemas.openxmlformats.org/drawingml/2006/main">
+              <a:graphicData uri="http://schemas.openxmlformats.org/drawingml/2006/picture">
+                <pic:pic xmlns:pic="http://schemas.openxmlformats.org/drawingml/2006/picture">
+                  <pic:nvPicPr>
+                    <pic:cNvPr id="1" name=""/>
+                    <pic:cNvPicPr/>
+                  </pic:nvPicPr>
+                  <pic:blipFill>
+                    <a:blip r:embed="rId58"/>
+                    <a:stretch>
+                      <a:fillRect/>
+                    </a:stretch>
+                  </pic:blipFill>
+                  <pic:spPr>
+                    <a:xfrm>
+                      <a:off x="0" y="0"/>
+                      <a:ext cx="4360759" cy="3931207"/>
+                    </a:xfrm>
+                    <a:prstGeom prst="rect">
+                      <a:avLst/>
+                    </a:prstGeom>
+                  </pic:spPr>
+                </pic:pic>
+              </a:graphicData>
+            </a:graphic>
+          </wp:inline>
+        </w:drawing>
+      </w:r>
+    </w:p>
+    <w:p>
+      <w:pPr>
+        <w:bidi/>
+        <w:rPr>
+          <w:rtl/>
+          <w:lang w:bidi="ar-EG"/>
+        </w:rPr>
+      </w:pPr>
+      <w:r>
+        <w:rPr>
+          <w:rFonts w:hint="cs"/>
+          <w:rtl/>
+          <w:lang w:bidi="ar-EG"/>
+        </w:rPr>
+        <w:lastRenderedPageBreak/>
+        <w:t xml:space="preserve">والمفروض انه كان بيرجعلنا ال </w:t>
+      </w:r>
+      <w:r>
+        <w:rPr>
+          <w:lang w:bidi="ar-EG"/>
+        </w:rPr>
+        <w:t>chunks</w:t>
+      </w:r>
+      <w:r>
+        <w:rPr>
+          <w:rFonts w:hint="cs"/>
+          <w:rtl/>
+          <w:lang w:bidi="ar-EG"/>
+        </w:rPr>
+        <w:t xml:space="preserve"> دي</w:t>
+      </w:r>
+    </w:p>
+    <w:p>
+      <w:pPr>
+        <w:bidi/>
+        <w:rPr>
+          <w:lang w:bidi="ar-EG"/>
+        </w:rPr>
+      </w:pPr>
+      <w:r>
+        <w:rPr>
+          <w:rFonts w:hint="cs"/>
+          <w:rtl/>
+          <w:lang w:bidi="ar-EG"/>
+        </w:rPr>
+        <w:t xml:space="preserve">فعاوزين بقي اانا نبدا نخرنها في ال </w:t>
+      </w:r>
+      <w:r>
+        <w:rPr>
+          <w:lang w:bidi="ar-EG"/>
+        </w:rPr>
+        <w:t>mongo</w:t>
+      </w:r>
+    </w:p>
+    <w:p>
+      <w:pPr>
+        <w:bidi/>
+        <w:rPr>
+          <w:lang w:bidi="ar-EG"/>
+        </w:rPr>
+      </w:pPr>
+      <w:r>
+        <w:rPr>
+          <w:rFonts w:hint="cs"/>
+          <w:rtl/>
+          <w:lang w:bidi="ar-EG"/>
+        </w:rPr>
+        <w:t xml:space="preserve">فروحنا علي ال </w:t>
+      </w:r>
+      <w:r>
+        <w:rPr>
+          <w:lang w:bidi="ar-EG"/>
+        </w:rPr>
+        <w:t>endpoint</w:t>
+      </w:r>
+    </w:p>
+    <w:p>
+      <w:pPr>
+        <w:bidi/>
+        <w:rPr>
+          <w:lang w:bidi="ar-EG"/>
+        </w:rPr>
+      </w:pPr>
+      <w:r>
+        <w:rPr>
+          <w:rFonts w:hint="cs"/>
+          <w:rtl/>
+          <w:lang w:bidi="ar-EG"/>
+        </w:rPr>
+        <w:t xml:space="preserve">خدنا كل ال </w:t>
+      </w:r>
+      <w:r>
+        <w:rPr>
+          <w:lang w:bidi="ar-EG"/>
+        </w:rPr>
+        <w:t>chunks</w:t>
+      </w:r>
+      <w:r>
+        <w:rPr>
+          <w:rFonts w:hint="cs"/>
+          <w:rtl/>
+          <w:lang w:bidi="ar-EG"/>
+        </w:rPr>
+        <w:t xml:space="preserve"> الي كانت بترجعلنا والي هي </w:t>
+      </w:r>
+      <w:proofErr w:type="spellStart"/>
+      <w:r>
+        <w:rPr>
+          <w:lang w:bidi="ar-EG"/>
+        </w:rPr>
+        <w:t>file_chunks</w:t>
+      </w:r>
+      <w:proofErr w:type="spellEnd"/>
+    </w:p>
+    <w:p>
+      <w:pPr>
+        <w:bidi/>
+        <w:rPr>
+          <w:rtl/>
+          <w:lang w:bidi="ar-EG"/>
+        </w:rPr>
+      </w:pPr>
+      <w:r>
+        <w:rPr>
+          <w:rFonts w:hint="cs"/>
+          <w:rtl/>
+          <w:lang w:bidi="ar-EG"/>
+        </w:rPr>
+        <w:t xml:space="preserve">وبدانا اننا نجهز ال </w:t>
+      </w:r>
+      <w:r>
+        <w:rPr>
+          <w:lang w:bidi="ar-EG"/>
+        </w:rPr>
+        <w:t>chunks</w:t>
+      </w:r>
+      <w:r>
+        <w:rPr>
+          <w:rFonts w:hint="cs"/>
+          <w:rtl/>
+          <w:lang w:bidi="ar-EG"/>
+        </w:rPr>
+        <w:t xml:space="preserve"> دي عشان نضبط شكلها وندخلها علي ال </w:t>
+      </w:r>
+      <w:proofErr w:type="spellStart"/>
+      <w:r>
+        <w:rPr>
+          <w:lang w:bidi="ar-EG"/>
+        </w:rPr>
+        <w:t>DataChunk</w:t>
+      </w:r>
+      <w:proofErr w:type="spellEnd"/>
+    </w:p>
+    <w:p>
+      <w:pPr>
+        <w:bidi/>
+        <w:rPr>
+          <w:lang w:bidi="ar-EG"/>
+        </w:rPr>
+      </w:pPr>
+      <w:r>
+        <w:rPr>
+          <w:rFonts w:hint="cs"/>
+          <w:rtl/>
+          <w:lang w:bidi="ar-EG"/>
+        </w:rPr>
+        <w:t xml:space="preserve">والي هنبدا اننا نخزنها جوه ال </w:t>
+      </w:r>
+      <w:r>
+        <w:rPr>
+          <w:lang w:bidi="ar-EG"/>
+        </w:rPr>
+        <w:t>mongo</w:t>
+      </w:r>
+    </w:p>
+    <w:p>
+      <w:pPr>
+        <w:bidi/>
+        <w:rPr>
+          <w:rtl/>
+          <w:lang w:bidi="ar-EG"/>
+        </w:rPr>
+      </w:pPr>
+      <w:r>
+        <w:rPr>
+          <w:rFonts w:hint="cs"/>
+          <w:rtl/>
+          <w:lang w:bidi="ar-EG"/>
+        </w:rPr>
+        <w:t xml:space="preserve">والي هي ال </w:t>
+      </w:r>
+      <w:r>
+        <w:rPr>
+          <w:lang w:bidi="ar-EG"/>
+        </w:rPr>
+        <w:t>scheme</w:t>
+      </w:r>
+      <w:r>
+        <w:rPr>
+          <w:rFonts w:hint="cs"/>
+          <w:rtl/>
+          <w:lang w:bidi="ar-EG"/>
+        </w:rPr>
+        <w:t xml:space="preserve"> الي معموله من </w:t>
+      </w:r>
+      <w:proofErr w:type="spellStart"/>
+      <w:r>
+        <w:rPr>
+          <w:lang w:bidi="ar-EG"/>
+        </w:rPr>
+        <w:t>pydantic</w:t>
+      </w:r>
+      <w:proofErr w:type="spellEnd"/>
+      <w:r>
+        <w:rPr>
+          <w:rFonts w:hint="cs"/>
+          <w:rtl/>
+          <w:lang w:bidi="ar-EG"/>
+        </w:rPr>
+        <w:t xml:space="preserve"> وده شكلها</w:t>
+      </w:r>
+    </w:p>
+    <w:p>
+      <w:pPr>
+        <w:bidi/>
+        <w:rPr>
+          <w:rtl/>
+          <w:lang w:bidi="ar-EG"/>
+        </w:rPr>
+      </w:pPr>
+      <w:r>
+        <w:rPr>
+          <w:rFonts w:hint="cs"/>
+          <w:rtl/>
+          <w:lang w:bidi="ar-EG"/>
+        </w:rPr>
+        <w:t xml:space="preserve">وملاحظه بسيطه اننا عدلنا ال </w:t>
+      </w:r>
+      <w:r>
+        <w:rPr>
+          <w:lang w:bidi="ar-EG"/>
+        </w:rPr>
+        <w:t>_id</w:t>
+      </w:r>
+      <w:r>
+        <w:rPr>
+          <w:rFonts w:hint="cs"/>
+          <w:rtl/>
+          <w:lang w:bidi="ar-EG"/>
+        </w:rPr>
+        <w:t xml:space="preserve"> بحيث ان هي دي الطريقه الي بيقدر ال </w:t>
+      </w:r>
+      <w:r>
+        <w:rPr>
+          <w:lang w:bidi="ar-EG"/>
+        </w:rPr>
+        <w:t>python</w:t>
+      </w:r>
+      <w:r>
+        <w:rPr>
+          <w:rFonts w:hint="cs"/>
+          <w:rtl/>
+          <w:lang w:bidi="ar-EG"/>
+        </w:rPr>
+        <w:t xml:space="preserve"> انه يتعامل معاها</w:t>
+      </w:r>
+    </w:p>
+    <w:p>
+      <w:pPr>
+        <w:bidi/>
+        <w:rPr>
+          <w:rFonts w:hint="cs"/>
+          <w:rtl/>
+          <w:lang w:bidi="ar-EG"/>
+        </w:rPr>
+      </w:pPr>
+      <w:r>
+        <w:rPr>
+          <w:rFonts w:hint="cs"/>
+          <w:rtl/>
+          <w:lang w:bidi="ar-EG"/>
+        </w:rPr>
+        <w:t xml:space="preserve">واي </w:t>
+      </w:r>
+      <w:r>
+        <w:rPr>
+          <w:lang w:bidi="ar-EG"/>
+        </w:rPr>
+        <w:t>.</w:t>
+      </w:r>
+      <w:proofErr w:type="spellStart"/>
+      <w:r>
+        <w:rPr>
+          <w:lang w:bidi="ar-EG"/>
+        </w:rPr>
+        <w:t>model_dump</w:t>
+      </w:r>
+      <w:proofErr w:type="spellEnd"/>
+      <w:r>
+        <w:rPr>
+          <w:lang w:bidi="ar-EG"/>
+        </w:rPr>
+        <w:t>()</w:t>
+      </w:r>
+      <w:r>
+        <w:rPr>
+          <w:rFonts w:hint="cs"/>
+          <w:rtl/>
+          <w:lang w:bidi="ar-EG"/>
+        </w:rPr>
+        <w:t xml:space="preserve"> لازم تاخد ال </w:t>
+      </w:r>
+      <w:r>
+        <w:rPr>
+          <w:lang w:bidi="ar-EG"/>
+        </w:rPr>
+        <w:t>parameters</w:t>
+      </w:r>
+      <w:r>
+        <w:rPr>
+          <w:rFonts w:hint="cs"/>
+          <w:rtl/>
+          <w:lang w:bidi="ar-EG"/>
+        </w:rPr>
+        <w:t xml:space="preserve"> دي بقي </w:t>
+      </w:r>
+      <w:proofErr w:type="spellStart"/>
+      <w:r>
+        <w:rPr>
+          <w:lang w:bidi="ar-EG"/>
+        </w:rPr>
+        <w:t>by_alias</w:t>
+      </w:r>
+      <w:proofErr w:type="spellEnd"/>
+      <w:r>
+        <w:rPr>
+          <w:lang w:bidi="ar-EG"/>
+        </w:rPr>
+        <w:t xml:space="preserve">=True, </w:t>
+      </w:r>
+      <w:proofErr w:type="spellStart"/>
+      <w:r>
+        <w:rPr>
+          <w:lang w:bidi="ar-EG"/>
+        </w:rPr>
+        <w:t>exclude_unset</w:t>
+      </w:r>
+      <w:proofErr w:type="spellEnd"/>
+      <w:r>
+        <w:rPr>
+          <w:lang w:bidi="ar-EG"/>
+        </w:rPr>
+        <w:t>=True</w:t>
+      </w:r>
+    </w:p>
+    <w:p>
+      <w:pPr>
+        <w:bidi/>
+        <w:rPr>
+          <w:lang w:bidi="ar-EG"/>
+        </w:rPr>
+      </w:pPr>
+      <w:r>
+        <w:rPr>
+          <w:rFonts w:cs="Arial"/>
+          <w:rtl/>
+          <w:lang w:bidi="ar-EG"/>
+        </w:rPr>
+        <w:drawing>
+          <wp:inline distT="0" distB="0" distL="0" distR="0" wp14:anchorId="4C13EDFA" wp14:editId="57273730">
+            <wp:extent cx="3752699" cy="2106233"/>
+            <wp:effectExtent l="0" t="0" r="635" b="8890"/>
+            <wp:docPr id="56" name="Picture 56"/>
+            <wp:cNvGraphicFramePr>
+              <a:graphicFrameLocks xmlns:a="http://schemas.openxmlformats.org/drawingml/2006/main" noChangeAspect="1"/>
+            </wp:cNvGraphicFramePr>
+            <a:graphic xmlns:a="http://schemas.openxmlformats.org/drawingml/2006/main">
+              <a:graphicData uri="http://schemas.openxmlformats.org/drawingml/2006/picture">
+                <pic:pic xmlns:pic="http://schemas.openxmlformats.org/drawingml/2006/picture">
+                  <pic:nvPicPr>
+                    <pic:cNvPr id="1" name=""/>
+                    <pic:cNvPicPr/>
+                  </pic:nvPicPr>
+                  <pic:blipFill>
+                    <a:blip r:embed="rId59"/>
+                    <a:stretch>
+                      <a:fillRect/>
+                    </a:stretch>
+                  </pic:blipFill>
+                  <pic:spPr>
+                    <a:xfrm>
+                      <a:off x="0" y="0"/>
+                      <a:ext cx="3774996" cy="2118747"/>
+                    </a:xfrm>
+                    <a:prstGeom prst="rect">
+                      <a:avLst/>
+                    </a:prstGeom>
+                  </pic:spPr>
+                </pic:pic>
+              </a:graphicData>
+            </a:graphic>
+          </wp:inline>
+        </w:drawing>
+      </w:r>
+    </w:p>
+    <w:p>
+      <w:pPr>
+        <w:bidi/>
+        <w:rPr>
+          <w:rtl/>
+          <w:lang w:bidi="ar-EG"/>
+        </w:rPr>
+      </w:pPr>
+      <w:r>
+        <w:rPr>
+          <w:rFonts w:hint="cs"/>
+          <w:rtl/>
+          <w:lang w:bidi="ar-EG"/>
+        </w:rPr>
+        <w:t>ود</w:t>
+      </w:r>
+      <w:r>
+        <w:rPr>
+          <w:rFonts w:hint="cs"/>
+          <w:rtl/>
+          <w:lang w:bidi="ar-EG"/>
+        </w:rPr>
+        <w:t xml:space="preserve">ه شكل ال </w:t>
+      </w:r>
+      <w:r>
+        <w:rPr>
+          <w:lang w:bidi="ar-EG"/>
+        </w:rPr>
+        <w:t>chunks</w:t>
+      </w:r>
+      <w:r>
+        <w:rPr>
+          <w:rFonts w:hint="cs"/>
+          <w:rtl/>
+          <w:lang w:bidi="ar-EG"/>
+        </w:rPr>
+        <w:t xml:space="preserve"> الي هتتخزن والكود الي خزناه بيها</w:t>
+      </w:r>
+    </w:p>
+    <w:p>
+      <w:pPr>
+        <w:bidi/>
+        <w:rPr>
+          <w:rtl/>
+          <w:lang w:bidi="ar-EG"/>
+        </w:rPr>
+      </w:pPr>
+      <w:r>
+        <w:rPr>
+          <w:rFonts w:cs="Arial"/>
+          <w:rtl/>
+          <w:lang w:bidi="ar-EG"/>
+        </w:rPr>
+        <w:drawing>
+          <wp:inline distT="0" distB="0" distL="0" distR="0" wp14:anchorId="74CAD78B" wp14:editId="7D38E7D5">
+            <wp:extent cx="3665394" cy="2726724"/>
+            <wp:effectExtent l="0" t="0" r="0" b="0"/>
+            <wp:docPr id="57" name="Picture 57"/>
+            <wp:cNvGraphicFramePr>
+              <a:graphicFrameLocks xmlns:a="http://schemas.openxmlformats.org/drawingml/2006/main" noChangeAspect="1"/>
+            </wp:cNvGraphicFramePr>
+            <a:graphic xmlns:a="http://schemas.openxmlformats.org/drawingml/2006/main">
+              <a:graphicData uri="http://schemas.openxmlformats.org/drawingml/2006/picture">
+                <pic:pic xmlns:pic="http://schemas.openxmlformats.org/drawingml/2006/picture">
+                  <pic:nvPicPr>
+                    <pic:cNvPr id="1" name=""/>
+                    <pic:cNvPicPr/>
+                  </pic:nvPicPr>
+                  <pic:blipFill>
+                    <a:blip r:embed="rId60"/>
+                    <a:stretch>
+                      <a:fillRect/>
+                    </a:stretch>
+                  </pic:blipFill>
+                  <pic:spPr>
+                    <a:xfrm>
+                      <a:off x="0" y="0"/>
+                      <a:ext cx="3669652" cy="2729892"/>
+                    </a:xfrm>
+                    <a:prstGeom prst="rect">
+                      <a:avLst/>
+                    </a:prstGeom>
+                  </pic:spPr>
+                </pic:pic>
+              </a:graphicData>
+            </a:graphic>
+          </wp:inline>
+        </w:drawing>
+      </w:r>
+    </w:p>
+    <w:p>
+      <w:pPr>
+        <w:bidi/>
+        <w:rPr>
+          <w:rtl/>
+          <w:lang w:bidi="ar-EG"/>
+        </w:rPr>
+      </w:pPr>
+    </w:p>
+    <w:p>
+      <w:pPr>
+        <w:bidi/>
+        <w:rPr>
+          <w:rtl/>
+          <w:lang w:bidi="ar-EG"/>
+        </w:rPr>
+      </w:pPr>
+      <w:r>
+        <w:rPr>
+          <w:rFonts w:hint="cs"/>
+          <w:rtl/>
+          <w:lang w:bidi="ar-EG"/>
+        </w:rPr>
+        <w:lastRenderedPageBreak/>
+        <w:t xml:space="preserve">ورجعنا بقي ل </w:t>
+      </w:r>
+      <w:proofErr w:type="spellStart"/>
+      <w:r>
+        <w:rPr>
+          <w:lang w:bidi="ar-EG"/>
+        </w:rPr>
+        <w:t>ChunkModel</w:t>
+      </w:r>
+      <w:proofErr w:type="spellEnd"/>
+    </w:p>
+    <w:p>
+      <w:pPr>
+        <w:bidi/>
+        <w:rPr>
+          <w:lang w:bidi="ar-EG"/>
+        </w:rPr>
+      </w:pPr>
+      <w:r>
+        <w:rPr>
+          <w:rFonts w:hint="cs"/>
+          <w:rtl/>
+          <w:lang w:bidi="ar-EG"/>
+        </w:rPr>
+        <w:t xml:space="preserve">لان في </w:t>
+      </w:r>
+      <w:r>
+        <w:rPr>
+          <w:lang w:bidi="ar-EG"/>
+        </w:rPr>
+        <w:t>function</w:t>
+      </w:r>
+      <w:r>
+        <w:rPr>
+          <w:rFonts w:hint="cs"/>
+          <w:rtl/>
+          <w:lang w:bidi="ar-EG"/>
+        </w:rPr>
+        <w:t xml:space="preserve"> كمان هنعوز اننا نعملها والي هي </w:t>
+      </w:r>
+      <w:proofErr w:type="spellStart"/>
+      <w:r>
+        <w:rPr>
+          <w:lang w:bidi="ar-EG"/>
+        </w:rPr>
+        <w:t>delete_chunks</w:t>
+      </w:r>
+      <w:proofErr w:type="spellEnd"/>
+    </w:p>
+    <w:p>
+      <w:pPr>
+        <w:bidi/>
+        <w:rPr>
+          <w:rFonts w:hint="cs"/>
+          <w:lang w:bidi="ar-EG"/>
+        </w:rPr>
+      </w:pPr>
+    </w:p>
+    <w:p>
+      <w:pPr>
+        <w:bidi/>
+        <w:rPr>
+          <w:rFonts w:hint="cs"/>
+          <w:lang w:bidi="ar-EG"/>
+        </w:rPr>
+      </w:pPr>
     </w:p>
     <w:sectPr>
       <w:pgSz w:w="12240" w:h="15840"/>
@@ -10197,7 +13239,6 @@
   <w:style w:type="character" w:default="1" w:styleId="DefaultParagraphFont">
     <w:name w:val="Default Paragraph Font"/>
     <w:uiPriority w:val="1"/>
-    <w:semiHidden/>
     <w:unhideWhenUsed/>
   </w:style>
   <w:style w:type="table" w:default="1" w:styleId="TableNormal">

</xml_diff>